<commit_message>
Update for mid year review at PayPal, received exceeding expectations
</commit_message>
<xml_diff>
--- a/Resume.docx
+++ b/Resume.docx
@@ -1,6 +1,6 @@
 
 <file path=word/document.xml><?xml version="1.0" encoding="utf-8"?>
-<w:document xmlns:wpc="http://schemas.microsoft.com/office/word/2010/wordprocessingCanvas" xmlns:cx="http://schemas.microsoft.com/office/drawing/2014/chartex" xmlns:cx1="http://schemas.microsoft.com/office/drawing/2015/9/8/chartex" xmlns:cx2="http://schemas.microsoft.com/office/drawing/2015/10/21/chartex" xmlns:cx3="http://schemas.microsoft.com/office/drawing/2016/5/9/chartex" xmlns:cx4="http://schemas.microsoft.com/office/drawing/2016/5/10/chartex" xmlns:cx5="http://schemas.microsoft.com/office/drawing/2016/5/11/chartex" xmlns:cx6="http://schemas.microsoft.com/office/drawing/2016/5/12/chartex" xmlns:cx7="http://schemas.microsoft.com/office/drawing/2016/5/13/chartex" xmlns:cx8="http://schemas.microsoft.com/office/drawing/2016/5/14/chartex" xmlns:mc="http://schemas.openxmlformats.org/markup-compatibility/2006" xmlns:aink="http://schemas.microsoft.com/office/drawing/2016/ink" xmlns:am3d="http://schemas.microsoft.com/office/drawing/2017/model3d" xmlns:o="urn:schemas-microsoft-com:office:office" xmlns:oel="http://schemas.microsoft.com/office/2019/extlst" xmlns:r="http://schemas.openxmlformats.org/officeDocument/2006/relationships" xmlns:m="http://schemas.openxmlformats.org/officeDocument/2006/math" xmlns:v="urn:schemas-microsoft-com:vml" xmlns:wp14="http://schemas.microsoft.com/office/word/2010/wordprocessingDrawing" xmlns:wp="http://schemas.openxmlformats.org/drawingml/2006/wordprocessingDrawing" xmlns:w10="urn:schemas-microsoft-com:office:word" xmlns:w="http://schemas.openxmlformats.org/wordprocessingml/2006/main" xmlns:w14="http://schemas.microsoft.com/office/word/2010/wordml" xmlns:w15="http://schemas.microsoft.com/office/word/2012/wordml" xmlns:w16cex="http://schemas.microsoft.com/office/word/2018/wordml/cex" xmlns:w16cid="http://schemas.microsoft.com/office/word/2016/wordml/cid" xmlns:w16="http://schemas.microsoft.com/office/word/2018/wordml" xmlns:w16sdtdh="http://schemas.microsoft.com/office/word/2020/wordml/sdtdatahash" xmlns:w16se="http://schemas.microsoft.com/office/word/2015/wordml/symex" xmlns:wpg="http://schemas.microsoft.com/office/word/2010/wordprocessingGroup" xmlns:wpi="http://schemas.microsoft.com/office/word/2010/wordprocessingInk" xmlns:wne="http://schemas.microsoft.com/office/word/2006/wordml" xmlns:wps="http://schemas.microsoft.com/office/word/2010/wordprocessingShape" mc:Ignorable="w14 w15 w16se w16cid w16 w16cex w16sdtdh wp14">
+<w:document xmlns:wpc="http://schemas.microsoft.com/office/word/2010/wordprocessingCanvas" xmlns:cx="http://schemas.microsoft.com/office/drawing/2014/chartex" xmlns:cx1="http://schemas.microsoft.com/office/drawing/2015/9/8/chartex" xmlns:cx2="http://schemas.microsoft.com/office/drawing/2015/10/21/chartex" xmlns:cx3="http://schemas.microsoft.com/office/drawing/2016/5/9/chartex" xmlns:cx4="http://schemas.microsoft.com/office/drawing/2016/5/10/chartex" xmlns:cx5="http://schemas.microsoft.com/office/drawing/2016/5/11/chartex" xmlns:cx6="http://schemas.microsoft.com/office/drawing/2016/5/12/chartex" xmlns:cx7="http://schemas.microsoft.com/office/drawing/2016/5/13/chartex" xmlns:cx8="http://schemas.microsoft.com/office/drawing/2016/5/14/chartex" xmlns:mc="http://schemas.openxmlformats.org/markup-compatibility/2006" xmlns:aink="http://schemas.microsoft.com/office/drawing/2016/ink" xmlns:am3d="http://schemas.microsoft.com/office/drawing/2017/model3d" xmlns:o="urn:schemas-microsoft-com:office:office" xmlns:oel="http://schemas.microsoft.com/office/2019/extlst" xmlns:r="http://schemas.openxmlformats.org/officeDocument/2006/relationships" xmlns:m="http://schemas.openxmlformats.org/officeDocument/2006/math" xmlns:v="urn:schemas-microsoft-com:vml" xmlns:wp14="http://schemas.microsoft.com/office/word/2010/wordprocessingDrawing" xmlns:wp="http://schemas.openxmlformats.org/drawingml/2006/wordprocessingDrawing" xmlns:w10="urn:schemas-microsoft-com:office:word" xmlns:w="http://schemas.openxmlformats.org/wordprocessingml/2006/main" xmlns:w14="http://schemas.microsoft.com/office/word/2010/wordml" xmlns:w15="http://schemas.microsoft.com/office/word/2012/wordml" xmlns:w16cex="http://schemas.microsoft.com/office/word/2018/wordml/cex" xmlns:w16cid="http://schemas.microsoft.com/office/word/2016/wordml/cid" xmlns:w16="http://schemas.microsoft.com/office/word/2018/wordml" xmlns:w16du="http://schemas.microsoft.com/office/word/2023/wordml/word16du" xmlns:w16sdtdh="http://schemas.microsoft.com/office/word/2020/wordml/sdtdatahash" xmlns:w16se="http://schemas.microsoft.com/office/word/2015/wordml/symex" xmlns:wpg="http://schemas.microsoft.com/office/word/2010/wordprocessingGroup" xmlns:wpi="http://schemas.microsoft.com/office/word/2010/wordprocessingInk" xmlns:wne="http://schemas.microsoft.com/office/word/2006/wordml" xmlns:wps="http://schemas.microsoft.com/office/word/2010/wordprocessingShape" mc:Ignorable="w14 w15 w16se w16cid w16 w16cex w16sdtdh w16du wp14">
   <w:body>
     <w:p>
       <w:pPr>
@@ -70,7 +70,31 @@
           <w:sz w:val="18"/>
           <w:szCs w:val="18"/>
         </w:rPr>
-        <w:t>Austin, Texas 78754 • (361) 946-7678</w:t>
+        <w:t>Austin, Texas 7875</w:t>
+      </w:r>
+      <w:r>
+        <w:rPr>
+          <w:rFonts w:ascii="Times New Roman" w:hAnsi="Times New Roman" w:cs="Times New Roman"/>
+          <w:b/>
+          <w:bCs/>
+          <w:i/>
+          <w:iCs/>
+          <w:sz w:val="18"/>
+          <w:szCs w:val="18"/>
+        </w:rPr>
+        <w:t>8</w:t>
+      </w:r>
+      <w:r>
+        <w:rPr>
+          <w:rFonts w:ascii="Times New Roman" w:hAnsi="Times New Roman" w:cs="Times New Roman"/>
+          <w:b/>
+          <w:bCs/>
+          <w:i/>
+          <w:iCs/>
+          <w:sz w:val="18"/>
+          <w:szCs w:val="18"/>
+        </w:rPr>
+        <w:t xml:space="preserve"> • (361) 946-7678</w:t>
       </w:r>
       <w:r>
         <w:rPr>
@@ -126,33 +150,43 @@
           <w:sz w:val="18"/>
           <w:szCs w:val="18"/>
         </w:rPr>
-        <w:t>.NET/React/</w:t>
-      </w:r>
-      <w:proofErr w:type="spellStart"/>
-      <w:r>
-        <w:rPr>
-          <w:rFonts w:ascii="Times New Roman" w:hAnsi="Times New Roman" w:cs="Times New Roman"/>
-          <w:b/>
-          <w:bCs/>
-          <w:i/>
-          <w:iCs/>
-          <w:sz w:val="18"/>
-          <w:szCs w:val="18"/>
-        </w:rPr>
-        <w:t>NextJS</w:t>
-      </w:r>
-      <w:proofErr w:type="spellEnd"/>
-      <w:r>
-        <w:rPr>
-          <w:rFonts w:ascii="Times New Roman" w:hAnsi="Times New Roman" w:cs="Times New Roman"/>
-          <w:b/>
-          <w:bCs/>
-          <w:i/>
-          <w:iCs/>
-          <w:sz w:val="18"/>
-          <w:szCs w:val="18"/>
-        </w:rPr>
-        <w:t xml:space="preserve"> Full-stack Software Engineer</w:t>
+        <w:t xml:space="preserve">Driven, </w:t>
+      </w:r>
+      <w:r>
+        <w:rPr>
+          <w:rFonts w:ascii="Times New Roman" w:hAnsi="Times New Roman" w:cs="Times New Roman"/>
+          <w:b/>
+          <w:bCs/>
+          <w:i/>
+          <w:iCs/>
+          <w:sz w:val="18"/>
+          <w:szCs w:val="18"/>
+        </w:rPr>
+        <w:t>P</w:t>
+      </w:r>
+      <w:r>
+        <w:rPr>
+          <w:rFonts w:ascii="Times New Roman" w:hAnsi="Times New Roman" w:cs="Times New Roman"/>
+          <w:b/>
+          <w:bCs/>
+          <w:i/>
+          <w:iCs/>
+          <w:sz w:val="18"/>
+          <w:szCs w:val="18"/>
+        </w:rPr>
+        <w:t xml:space="preserve">roactive, </w:t>
+      </w:r>
+      <w:r>
+        <w:rPr>
+          <w:rFonts w:ascii="Times New Roman" w:hAnsi="Times New Roman" w:cs="Times New Roman"/>
+          <w:b/>
+          <w:bCs/>
+          <w:i/>
+          <w:iCs/>
+          <w:sz w:val="18"/>
+          <w:szCs w:val="18"/>
+        </w:rPr>
+        <w:t>Full-stack Software Engineer</w:t>
       </w:r>
       <w:r>
         <w:rPr>
@@ -220,7 +254,31 @@
           <w:sz w:val="18"/>
           <w:szCs w:val="18"/>
         </w:rPr>
-        <w:t xml:space="preserve">~2.5 years of professional experience </w:t>
+        <w:t>~</w:t>
+      </w:r>
+      <w:r>
+        <w:rPr>
+          <w:rFonts w:ascii="Times New Roman" w:hAnsi="Times New Roman" w:cs="Times New Roman"/>
+          <w:b/>
+          <w:bCs/>
+          <w:i/>
+          <w:iCs/>
+          <w:sz w:val="18"/>
+          <w:szCs w:val="18"/>
+        </w:rPr>
+        <w:t>4</w:t>
+      </w:r>
+      <w:r>
+        <w:rPr>
+          <w:rFonts w:ascii="Times New Roman" w:hAnsi="Times New Roman" w:cs="Times New Roman"/>
+          <w:b/>
+          <w:bCs/>
+          <w:i/>
+          <w:iCs/>
+          <w:sz w:val="18"/>
+          <w:szCs w:val="18"/>
+        </w:rPr>
+        <w:t xml:space="preserve"> years of professional experience </w:t>
       </w:r>
       <w:r>
         <w:rPr>
@@ -344,7 +402,7 @@
               </wp:anchor>
             </w:drawing>
           </mc:Choice>
-          <mc:Fallback xmlns:w16du="http://schemas.microsoft.com/office/word/2023/wordml/word16du">
+          <mc:Fallback>
             <w:pict>
               <v:line w14:anchorId="6A2C6B69" id="Straight Connector 6" o:spid="_x0000_s1026" style="position:absolute;z-index:251669504;visibility:visible;mso-wrap-style:square;mso-width-percent:0;mso-height-percent:0;mso-wrap-distance-left:9pt;mso-wrap-distance-top:0;mso-wrap-distance-right:9pt;mso-wrap-distance-bottom:0;mso-position-horizontal:absolute;mso-position-horizontal-relative:margin;mso-position-vertical:absolute;mso-position-vertical-relative:text;mso-width-percent:0;mso-height-percent:0;mso-width-relative:margin;mso-height-relative:margin" from="67.95pt,7pt" to="523pt,7pt" o:gfxdata="UEsDBBQABgAIAAAAIQC2gziS/gAAAOEBAAATAAAAW0NvbnRlbnRfVHlwZXNdLnhtbJSRQU7DMBBF&#10;90jcwfIWJU67QAgl6YK0S0CoHGBkTxKLZGx5TGhvj5O2G0SRWNoz/78nu9wcxkFMGNg6quQqL6RA&#10;0s5Y6ir5vt9lD1JwBDIwOMJKHpHlpr69KfdHjyxSmriSfYz+USnWPY7AufNIadK6MEJMx9ApD/oD&#10;OlTrorhX2lFEilmcO2RdNtjC5xDF9pCuTyYBB5bi6bQ4syoJ3g9WQ0ymaiLzg5KdCXlKLjvcW893&#10;SUOqXwnz5DrgnHtJTxOsQfEKIT7DmDSUCaxw7Rqn8787ZsmRM9e2VmPeBN4uqYvTtW7jvijg9N/y&#10;JsXecLq0q+WD6m8AAAD//wMAUEsDBBQABgAIAAAAIQA4/SH/1gAAAJQBAAALAAAAX3JlbHMvLnJl&#10;bHOkkMFqwzAMhu+DvYPRfXGawxijTi+j0GvpHsDYimMaW0Yy2fr2M4PBMnrbUb/Q94l/f/hMi1qR&#10;JVI2sOt6UJgd+ZiDgffL8ekFlFSbvV0oo4EbChzGx4f9GRdb25HMsYhqlCwG5lrLq9biZkxWOiqY&#10;22YiTra2kYMu1l1tQD30/bPm3wwYN0x18gb45AdQl1tp5j/sFB2T0FQ7R0nTNEV3j6o9feQzro1i&#10;OWA14Fm+Q8a1a8+Bvu/d/dMb2JY5uiPbhG/ktn4cqGU/er3pcvwCAAD//wMAUEsDBBQABgAIAAAA&#10;IQCXd2YEsgEAANQDAAAOAAAAZHJzL2Uyb0RvYy54bWysU01v2zAMvQ/YfxB0X+QUaLsZcXpo0V2G&#10;ttjHD1BlKhYgiYKkxc6/L6UkdrENGDb0QosS3yP5SG9uJmfZHmIy6Du+XjWcgVfYG7/r+I/v9x8+&#10;cpay9L206KHjB0j8Zvv+3WYMLVzggLaHyIjEp3YMHR9yDq0QSQ3gZFphAE+PGqOTmdy4E32UI7E7&#10;Ky6a5kqMGPsQUUFKdHt3fOTbyq81qPyodYLMbMeptlxtrPa5WLHdyHYXZRiMOpUh/6MKJ42npDPV&#10;ncyS/YzmNypnVMSEOq8UOoFaGwW1B+pm3fzSzbdBBqi9kDgpzDKlt6NVD/tb/xRJhjGkNoWnWLqY&#10;dHTlS/WxqYp1mMWCKTNFl5fX15+ahsarzm9iAYaY8mdAx8qh49b40ods5f5LypSMQs8h5dr6YhNa&#10;098ba6tTNgBubWR7SbPL07rMinCvosgrSLGUXk/5YOHI+hU0Mz0Vu67Z61YtnFIp8PnMaz1FF5im&#10;CmZg83fgKb5AoW7cv4BnRM2MPs9gZzzGP2VfpNDH+LMCx76LBM/YH+pQqzS0OlW505qX3XztV/jy&#10;M25fAAAA//8DAFBLAwQUAAYACAAAACEApWvtDt0AAAAKAQAADwAAAGRycy9kb3ducmV2LnhtbExP&#10;wUrDQBS8C/7D8gQvYjfaNtSYTZFALx4EGyk9brOv2WD2bchum/TvfcWD3mbeDPNm8vXkOnHGIbSe&#10;FDzNEhBItTctNQq+qs3jCkSImozuPKGCCwZYF7c3uc6MH+kTz9vYCA6hkGkFNsY+kzLUFp0OM98j&#10;sXb0g9OR6dBIM+iRw10nn5MklU63xB+s7rG0WH9vT07BvnmYb3YVVWMZP46pnS6792Wp1P3d9PYK&#10;IuIU/8xwrc/VoeBOB38iE0THfL58YSuDBW+6GpJFyujwe5FFLv9PKH4AAAD//wMAUEsBAi0AFAAG&#10;AAgAAAAhALaDOJL+AAAA4QEAABMAAAAAAAAAAAAAAAAAAAAAAFtDb250ZW50X1R5cGVzXS54bWxQ&#10;SwECLQAUAAYACAAAACEAOP0h/9YAAACUAQAACwAAAAAAAAAAAAAAAAAvAQAAX3JlbHMvLnJlbHNQ&#10;SwECLQAUAAYACAAAACEAl3dmBLIBAADUAwAADgAAAAAAAAAAAAAAAAAuAgAAZHJzL2Uyb0RvYy54&#10;bWxQSwECLQAUAAYACAAAACEApWvtDt0AAAAKAQAADwAAAAAAAAAAAAAAAAAMBAAAZHJzL2Rvd25y&#10;ZXYueG1sUEsFBgAAAAAEAAQA8wAAABYFAAAAAA==&#10;" strokecolor="black [3213]" strokeweight=".5pt">
                 <v:stroke joinstyle="miter"/>
@@ -412,15 +470,15 @@
           <w:sz w:val="15"/>
           <w:szCs w:val="15"/>
         </w:rPr>
-        <w:t xml:space="preserve"> / C#</w:t>
-      </w:r>
-      <w:r>
-        <w:rPr>
-          <w:rFonts w:asciiTheme="majorHAnsi" w:hAnsiTheme="majorHAnsi" w:cstheme="majorHAnsi"/>
-          <w:sz w:val="15"/>
-          <w:szCs w:val="15"/>
-        </w:rPr>
-        <w:t xml:space="preserve"> / C</w:t>
+        <w:t xml:space="preserve"> / </w:t>
+      </w:r>
+      <w:r>
+        <w:rPr>
+          <w:rFonts w:asciiTheme="majorHAnsi" w:hAnsiTheme="majorHAnsi" w:cstheme="majorHAnsi"/>
+          <w:sz w:val="15"/>
+          <w:szCs w:val="15"/>
+        </w:rPr>
+        <w:t>C</w:t>
       </w:r>
     </w:p>
     <w:p>
@@ -514,6 +572,14 @@
         </w:rPr>
         <w:t>.NET Core Web API</w:t>
       </w:r>
+      <w:r>
+        <w:rPr>
+          <w:rFonts w:asciiTheme="majorHAnsi" w:hAnsiTheme="majorHAnsi" w:cstheme="majorHAnsi"/>
+          <w:sz w:val="15"/>
+          <w:szCs w:val="15"/>
+        </w:rPr>
+        <w:t>/MVC/C#</w:t>
+      </w:r>
     </w:p>
     <w:p>
       <w:pPr>
@@ -538,7 +604,7 @@
           <w:sz w:val="15"/>
           <w:szCs w:val="15"/>
         </w:rPr>
-        <w:t>CI/CD / DevOps</w:t>
+        <w:t>CI/CD/DevOps</w:t>
       </w:r>
     </w:p>
     <w:p>
@@ -760,7 +826,7 @@
           <w:sz w:val="15"/>
           <w:szCs w:val="15"/>
         </w:rPr>
-        <w:t>/Stored Procedures/EF</w:t>
+        <w:t>/Stored Procedures</w:t>
       </w:r>
     </w:p>
     <w:p>
@@ -854,7 +920,25 @@
           <w:sz w:val="15"/>
           <w:szCs w:val="15"/>
         </w:rPr>
-        <w:t>ASP .NET Core MVC</w:t>
+        <w:t>KMS/</w:t>
+      </w:r>
+      <w:proofErr w:type="spellStart"/>
+      <w:r>
+        <w:rPr>
+          <w:rFonts w:asciiTheme="majorHAnsi" w:hAnsiTheme="majorHAnsi" w:cstheme="majorHAnsi"/>
+          <w:sz w:val="15"/>
+          <w:szCs w:val="15"/>
+        </w:rPr>
+        <w:t>HashiCorp</w:t>
+      </w:r>
+      <w:proofErr w:type="spellEnd"/>
+      <w:r>
+        <w:rPr>
+          <w:rFonts w:asciiTheme="majorHAnsi" w:hAnsiTheme="majorHAnsi" w:cstheme="majorHAnsi"/>
+          <w:sz w:val="15"/>
+          <w:szCs w:val="15"/>
+        </w:rPr>
+        <w:t xml:space="preserve"> Vault</w:t>
       </w:r>
     </w:p>
     <w:p>
@@ -900,13 +984,23 @@
           <w:szCs w:val="15"/>
         </w:rPr>
       </w:pPr>
-      <w:r>
-        <w:rPr>
-          <w:rFonts w:asciiTheme="majorHAnsi" w:hAnsiTheme="majorHAnsi" w:cstheme="majorHAnsi"/>
-          <w:sz w:val="15"/>
-          <w:szCs w:val="15"/>
-        </w:rPr>
-        <w:t>CesiumJS/ArcGIS</w:t>
+      <w:proofErr w:type="spellStart"/>
+      <w:r>
+        <w:rPr>
+          <w:rFonts w:asciiTheme="majorHAnsi" w:hAnsiTheme="majorHAnsi" w:cstheme="majorHAnsi"/>
+          <w:sz w:val="15"/>
+          <w:szCs w:val="15"/>
+        </w:rPr>
+        <w:t>TerraForm</w:t>
+      </w:r>
+      <w:proofErr w:type="spellEnd"/>
+      <w:r>
+        <w:rPr>
+          <w:rFonts w:asciiTheme="majorHAnsi" w:hAnsiTheme="majorHAnsi" w:cstheme="majorHAnsi"/>
+          <w:sz w:val="15"/>
+          <w:szCs w:val="15"/>
+        </w:rPr>
+        <w:t>/IaaS</w:t>
       </w:r>
     </w:p>
     <w:p>
@@ -950,6 +1044,7 @@
         </w:rPr>
         <w:t>/</w:t>
       </w:r>
+      <w:proofErr w:type="spellStart"/>
       <w:r>
         <w:rPr>
           <w:rFonts w:asciiTheme="majorHAnsi" w:hAnsiTheme="majorHAnsi" w:cstheme="majorHAnsi"/>
@@ -958,6 +1053,7 @@
         </w:rPr>
         <w:t>NextJS</w:t>
       </w:r>
+      <w:proofErr w:type="spellEnd"/>
     </w:p>
     <w:p>
       <w:pPr>
@@ -984,6 +1080,24 @@
         </w:rPr>
         <w:t>Java</w:t>
       </w:r>
+      <w:r>
+        <w:rPr>
+          <w:rFonts w:asciiTheme="majorHAnsi" w:hAnsiTheme="majorHAnsi" w:cstheme="majorHAnsi"/>
+          <w:sz w:val="15"/>
+          <w:szCs w:val="15"/>
+        </w:rPr>
+        <w:t>/</w:t>
+      </w:r>
+      <w:proofErr w:type="spellStart"/>
+      <w:r>
+        <w:rPr>
+          <w:rFonts w:asciiTheme="majorHAnsi" w:hAnsiTheme="majorHAnsi" w:cstheme="majorHAnsi"/>
+          <w:sz w:val="15"/>
+          <w:szCs w:val="15"/>
+        </w:rPr>
+        <w:t>SpringBoot</w:t>
+      </w:r>
+      <w:proofErr w:type="spellEnd"/>
     </w:p>
     <w:p>
       <w:pPr>
@@ -1098,7 +1212,7 @@
           <w:sz w:val="15"/>
           <w:szCs w:val="15"/>
         </w:rPr>
-        <w:t>Microsoft Azure</w:t>
+        <w:t>GCP/AWS/Azure</w:t>
       </w:r>
     </w:p>
     <w:p>
@@ -1210,7 +1324,7 @@
               </wp:anchor>
             </w:drawing>
           </mc:Choice>
-          <mc:Fallback xmlns:w16du="http://schemas.microsoft.com/office/word/2023/wordml/word16du">
+          <mc:Fallback>
             <w:pict>
               <v:line w14:anchorId="301C76BA" id="Straight Connector 3" o:spid="_x0000_s1026" style="position:absolute;z-index:251671552;visibility:visible;mso-wrap-style:square;mso-width-percent:0;mso-height-percent:0;mso-wrap-distance-left:9pt;mso-wrap-distance-top:0;mso-wrap-distance-right:9pt;mso-wrap-distance-bottom:0;mso-position-horizontal:right;mso-position-horizontal-relative:margin;mso-position-vertical:absolute;mso-position-vertical-relative:text;mso-width-percent:0;mso-height-percent:0;mso-width-relative:margin;mso-height-relative:margin" from="298pt,6.25pt" to="647.2pt,6.25pt" o:gfxdata="UEsDBBQABgAIAAAAIQC2gziS/gAAAOEBAAATAAAAW0NvbnRlbnRfVHlwZXNdLnhtbJSRQU7DMBBF&#10;90jcwfIWJU67QAgl6YK0S0CoHGBkTxKLZGx5TGhvj5O2G0SRWNoz/78nu9wcxkFMGNg6quQqL6RA&#10;0s5Y6ir5vt9lD1JwBDIwOMJKHpHlpr69KfdHjyxSmriSfYz+USnWPY7AufNIadK6MEJMx9ApD/oD&#10;OlTrorhX2lFEilmcO2RdNtjC5xDF9pCuTyYBB5bi6bQ4syoJ3g9WQ0ymaiLzg5KdCXlKLjvcW893&#10;SUOqXwnz5DrgnHtJTxOsQfEKIT7DmDSUCaxw7Rqn8787ZsmRM9e2VmPeBN4uqYvTtW7jvijg9N/y&#10;JsXecLq0q+WD6m8AAAD//wMAUEsDBBQABgAIAAAAIQA4/SH/1gAAAJQBAAALAAAAX3JlbHMvLnJl&#10;bHOkkMFqwzAMhu+DvYPRfXGawxijTi+j0GvpHsDYimMaW0Yy2fr2M4PBMnrbUb/Q94l/f/hMi1qR&#10;JVI2sOt6UJgd+ZiDgffL8ekFlFSbvV0oo4EbChzGx4f9GRdb25HMsYhqlCwG5lrLq9biZkxWOiqY&#10;22YiTra2kYMu1l1tQD30/bPm3wwYN0x18gb45AdQl1tp5j/sFB2T0FQ7R0nTNEV3j6o9feQzro1i&#10;OWA14Fm+Q8a1a8+Bvu/d/dMb2JY5uiPbhG/ktn4cqGU/er3pcvwCAAD//wMAUEsDBBQABgAIAAAA&#10;IQB77KZ3sgEAANQDAAAOAAAAZHJzL2Uyb0RvYy54bWysU8Fu2zAMvQ/YPwi6N3K6oCiMOD206C7D&#10;VnTbB6gyFQuQREHSYufvRymJXXQDhg270CLF90g+0du7yVl2gJgM+o6vVw1n4BX2xu87/v3b49Ut&#10;ZylL30uLHjp+hMTvdu/fbcfQwjUOaHuIjEh8asfQ8SHn0AqR1ABOphUG8HSpMTqZyY170Uc5Eruz&#10;4rppbsSIsQ8RFaRE0YfTJd9Vfq1B5S9aJ8jMdpx6y9XGal+KFbutbPdRhsGocxvyH7pw0ngqOlM9&#10;yCzZj2h+oXJGRUyo80qhE6i1UVBnoGnWzZtpvg4yQJ2FxElhlin9P1r1+XDvnyLJMIbUpvAUyxST&#10;jq58qT82VbGOs1gwZaYouNl82NxuSFN1uRMLMMSUPwI6Vg4dt8aXOWQrD59SpmKUekkpYeuLTWhN&#10;/2isrU7ZALi3kR0kvV2e1uWtCPcqi7yCFEvr9ZSPFk6sz6CZ6anZda1et2rhlEqBzxde6ym7wDR1&#10;MAObPwPP+QUKdeP+BjwjamX0eQY74zH+rvoihT7lXxQ4zV0keMH+WB+1SkOrU5U7r3nZzdd+hS8/&#10;4+4nAAAA//8DAFBLAwQUAAYACAAAACEA+DR+7dwAAAAGAQAADwAAAGRycy9kb3ducmV2LnhtbEyP&#10;QUvDQBCF74L/YRnBi9iN1YY2zaZIoBcPgo0Uj9vsNBvMzobstkn/vSMe6vG9N7z3Tb6ZXCfOOITW&#10;k4KnWQICqfampUbBZ7V9XIIIUZPRnSdUcMEAm+L2JteZ8SN94HkXG8ElFDKtwMbYZ1KG2qLTYeZ7&#10;JM6OfnA6shwaaQY9crnr5DxJUul0S7xgdY+lxfp7d3IKvpqH5+2+omos4/sxtdNl/7Yolbq/m17X&#10;ICJO8XoMv/iMDgUzHfyJTBCdAn4ksjtfgOA0XS1fQBz+DFnk8j9+8QMAAP//AwBQSwECLQAUAAYA&#10;CAAAACEAtoM4kv4AAADhAQAAEwAAAAAAAAAAAAAAAAAAAAAAW0NvbnRlbnRfVHlwZXNdLnhtbFBL&#10;AQItABQABgAIAAAAIQA4/SH/1gAAAJQBAAALAAAAAAAAAAAAAAAAAC8BAABfcmVscy8ucmVsc1BL&#10;AQItABQABgAIAAAAIQB77KZ3sgEAANQDAAAOAAAAAAAAAAAAAAAAAC4CAABkcnMvZTJvRG9jLnht&#10;bFBLAQItABQABgAIAAAAIQD4NH7t3AAAAAYBAAAPAAAAAAAAAAAAAAAAAAwEAABkcnMvZG93bnJl&#10;di54bWxQSwUGAAAAAAQABADzAAAAFQUAAAAA&#10;" strokecolor="black [3213]" strokeweight=".5pt">
                 <v:stroke joinstyle="miter"/>
@@ -1268,7 +1382,19 @@
           <w:sz w:val="18"/>
           <w:szCs w:val="18"/>
         </w:rPr>
-        <w:t>Software Engineer 1</w:t>
+        <w:t xml:space="preserve">Software Engineer </w:t>
+      </w:r>
+      <w:r>
+        <w:rPr>
+          <w:rFonts w:ascii="Times New Roman" w:hAnsi="Times New Roman" w:cs="Times New Roman"/>
+          <w:b/>
+          <w:bCs/>
+          <w:i/>
+          <w:iCs/>
+          <w:sz w:val="18"/>
+          <w:szCs w:val="18"/>
+        </w:rPr>
+        <w:t>2 – T23 / Cybersecurity Engineer</w:t>
       </w:r>
       <w:r>
         <w:rPr>
@@ -1292,7 +1418,43 @@
           <w:sz w:val="18"/>
           <w:szCs w:val="18"/>
         </w:rPr>
-        <w:t>Dell Technologies, Round Rock, Texas</w:t>
+        <w:t>PayPal</w:t>
+      </w:r>
+      <w:r>
+        <w:rPr>
+          <w:rFonts w:ascii="Times New Roman" w:hAnsi="Times New Roman" w:cs="Times New Roman"/>
+          <w:b/>
+          <w:bCs/>
+          <w:i/>
+          <w:iCs/>
+          <w:sz w:val="18"/>
+          <w:szCs w:val="18"/>
+        </w:rPr>
+        <w:t xml:space="preserve">, </w:t>
+      </w:r>
+      <w:r>
+        <w:rPr>
+          <w:rFonts w:ascii="Times New Roman" w:hAnsi="Times New Roman" w:cs="Times New Roman"/>
+          <w:b/>
+          <w:bCs/>
+          <w:i/>
+          <w:iCs/>
+          <w:sz w:val="18"/>
+          <w:szCs w:val="18"/>
+        </w:rPr>
+        <w:t>Austin</w:t>
+      </w:r>
+      <w:r>
+        <w:rPr>
+          <w:rFonts w:ascii="Times New Roman" w:hAnsi="Times New Roman" w:cs="Times New Roman"/>
+          <w:b/>
+          <w:bCs/>
+          <w:i/>
+          <w:iCs/>
+          <w:sz w:val="18"/>
+          <w:szCs w:val="18"/>
+        </w:rPr>
+        <w:t>, Texas</w:t>
       </w:r>
       <w:r>
         <w:rPr>
@@ -1305,7 +1467,43 @@
           <w:szCs w:val="18"/>
         </w:rPr>
         <w:tab/>
-        <w:t xml:space="preserve">08/2023 </w:t>
+        <w:t>0</w:t>
+      </w:r>
+      <w:r>
+        <w:rPr>
+          <w:rFonts w:ascii="Times New Roman" w:hAnsi="Times New Roman" w:cs="Times New Roman"/>
+          <w:b/>
+          <w:bCs/>
+          <w:i/>
+          <w:iCs/>
+          <w:sz w:val="18"/>
+          <w:szCs w:val="18"/>
+        </w:rPr>
+        <w:t>9</w:t>
+      </w:r>
+      <w:r>
+        <w:rPr>
+          <w:rFonts w:ascii="Times New Roman" w:hAnsi="Times New Roman" w:cs="Times New Roman"/>
+          <w:b/>
+          <w:bCs/>
+          <w:i/>
+          <w:iCs/>
+          <w:sz w:val="18"/>
+          <w:szCs w:val="18"/>
+        </w:rPr>
+        <w:t>/202</w:t>
+      </w:r>
+      <w:r>
+        <w:rPr>
+          <w:rFonts w:ascii="Times New Roman" w:hAnsi="Times New Roman" w:cs="Times New Roman"/>
+          <w:b/>
+          <w:bCs/>
+          <w:i/>
+          <w:iCs/>
+          <w:sz w:val="18"/>
+          <w:szCs w:val="18"/>
+        </w:rPr>
+        <w:t>4</w:t>
       </w:r>
       <w:r>
         <w:rPr>
@@ -1329,19 +1527,7 @@
           <w:sz w:val="18"/>
           <w:szCs w:val="18"/>
         </w:rPr>
-        <w:t xml:space="preserve"> </w:t>
-      </w:r>
-      <w:r>
-        <w:rPr>
-          <w:rFonts w:ascii="Times New Roman" w:hAnsi="Times New Roman" w:cs="Times New Roman"/>
-          <w:b/>
-          <w:bCs/>
-          <w:i/>
-          <w:iCs/>
-          <w:sz w:val="18"/>
-          <w:szCs w:val="18"/>
-        </w:rPr>
-        <w:t>Present</w:t>
+        <w:t xml:space="preserve"> Present</w:t>
       </w:r>
     </w:p>
     <w:p>
@@ -1367,7 +1553,57 @@
           <w:sz w:val="15"/>
           <w:szCs w:val="15"/>
         </w:rPr>
-        <w:t>Backend Software Engineer on the Customer Integration Layer Microservices team | Part of the ITDP (IT Development Program, a rotational program for new grads)</w:t>
+        <w:t>Cybersecurity</w:t>
+      </w:r>
+      <w:r>
+        <w:rPr>
+          <w:rFonts w:ascii="Times New Roman" w:hAnsi="Times New Roman" w:cs="Times New Roman"/>
+          <w:i/>
+          <w:iCs/>
+          <w:sz w:val="15"/>
+          <w:szCs w:val="15"/>
+        </w:rPr>
+        <w:t xml:space="preserve"> Engineer on the </w:t>
+      </w:r>
+      <w:r>
+        <w:rPr>
+          <w:rFonts w:ascii="Times New Roman" w:hAnsi="Times New Roman" w:cs="Times New Roman"/>
+          <w:i/>
+          <w:iCs/>
+          <w:sz w:val="15"/>
+          <w:szCs w:val="15"/>
+        </w:rPr>
+        <w:t>Secret Management</w:t>
+      </w:r>
+      <w:r>
+        <w:rPr>
+          <w:rFonts w:ascii="Times New Roman" w:hAnsi="Times New Roman" w:cs="Times New Roman"/>
+          <w:i/>
+          <w:iCs/>
+          <w:sz w:val="15"/>
+          <w:szCs w:val="15"/>
+        </w:rPr>
+        <w:t xml:space="preserve"> team |</w:t>
+      </w:r>
+      <w:r>
+        <w:rPr>
+          <w:rFonts w:ascii="Times New Roman" w:hAnsi="Times New Roman" w:cs="Times New Roman"/>
+          <w:i/>
+          <w:iCs/>
+          <w:sz w:val="15"/>
+          <w:szCs w:val="15"/>
+        </w:rPr>
+        <w:t xml:space="preserve"> </w:t>
+      </w:r>
+      <w:r>
+        <w:rPr>
+          <w:rFonts w:ascii="Times New Roman" w:hAnsi="Times New Roman" w:cs="Times New Roman"/>
+          <w:i/>
+          <w:iCs/>
+          <w:sz w:val="15"/>
+          <w:szCs w:val="15"/>
+        </w:rPr>
+        <w:t>Key Contributor / Driver for the Key Management System Modernization OKRs</w:t>
       </w:r>
     </w:p>
     <w:p>
@@ -1380,61 +1616,35 @@
         <w:ind w:left="720"/>
         <w:rPr>
           <w:rFonts w:asciiTheme="majorHAnsi" w:hAnsiTheme="majorHAnsi" w:cstheme="majorHAnsi"/>
-          <w:b/>
-          <w:bCs/>
-          <w:i/>
-          <w:iCs/>
-          <w:sz w:val="15"/>
-          <w:szCs w:val="15"/>
-        </w:rPr>
-      </w:pPr>
-      <w:r>
-        <w:rPr>
-          <w:rFonts w:asciiTheme="majorHAnsi" w:hAnsiTheme="majorHAnsi" w:cstheme="majorHAnsi"/>
-          <w:sz w:val="15"/>
-          <w:szCs w:val="15"/>
-        </w:rPr>
-        <w:t xml:space="preserve">Remediated 100+ vulnerabilities across all my teams’ repositories. </w:t>
-      </w:r>
-      <w:r>
-        <w:rPr>
-          <w:rFonts w:asciiTheme="majorHAnsi" w:hAnsiTheme="majorHAnsi" w:cstheme="majorHAnsi"/>
-          <w:sz w:val="15"/>
-          <w:szCs w:val="15"/>
-        </w:rPr>
-        <w:t>Reduced</w:t>
-      </w:r>
-      <w:r>
-        <w:rPr>
-          <w:rFonts w:asciiTheme="majorHAnsi" w:hAnsiTheme="majorHAnsi" w:cstheme="majorHAnsi"/>
-          <w:sz w:val="15"/>
-          <w:szCs w:val="15"/>
-        </w:rPr>
-        <w:t xml:space="preserve"> total vulnerabilities reported</w:t>
-      </w:r>
-      <w:r>
-        <w:rPr>
-          <w:rFonts w:asciiTheme="majorHAnsi" w:hAnsiTheme="majorHAnsi" w:cstheme="majorHAnsi"/>
-          <w:sz w:val="15"/>
-          <w:szCs w:val="15"/>
-        </w:rPr>
-        <w:t xml:space="preserve"> locally</w:t>
-      </w:r>
-      <w:r>
-        <w:rPr>
-          <w:rFonts w:asciiTheme="majorHAnsi" w:hAnsiTheme="majorHAnsi" w:cstheme="majorHAnsi"/>
-          <w:sz w:val="15"/>
-          <w:szCs w:val="15"/>
-        </w:rPr>
-        <w:t xml:space="preserve"> to 0%</w:t>
-      </w:r>
-      <w:r>
-        <w:rPr>
-          <w:rFonts w:asciiTheme="majorHAnsi" w:hAnsiTheme="majorHAnsi" w:cstheme="majorHAnsi"/>
-          <w:sz w:val="15"/>
-          <w:szCs w:val="15"/>
-        </w:rPr>
-        <w:t xml:space="preserve"> </w:t>
+          <w:sz w:val="15"/>
+          <w:szCs w:val="15"/>
+        </w:rPr>
+      </w:pPr>
+      <w:r>
+        <w:rPr>
+          <w:rFonts w:asciiTheme="majorHAnsi" w:hAnsiTheme="majorHAnsi" w:cstheme="majorHAnsi"/>
+          <w:sz w:val="15"/>
+          <w:szCs w:val="15"/>
+        </w:rPr>
+        <w:t xml:space="preserve">Saved the company $800K annually by driving the </w:t>
+      </w:r>
+      <w:proofErr w:type="spellStart"/>
+      <w:r>
+        <w:rPr>
+          <w:rFonts w:asciiTheme="majorHAnsi" w:hAnsiTheme="majorHAnsi" w:cstheme="majorHAnsi"/>
+          <w:sz w:val="15"/>
+          <w:szCs w:val="15"/>
+        </w:rPr>
+        <w:t>Fortanix</w:t>
+      </w:r>
+      <w:proofErr w:type="spellEnd"/>
+      <w:r>
+        <w:rPr>
+          <w:rFonts w:asciiTheme="majorHAnsi" w:hAnsiTheme="majorHAnsi" w:cstheme="majorHAnsi"/>
+          <w:sz w:val="15"/>
+          <w:szCs w:val="15"/>
+        </w:rPr>
+        <w:t xml:space="preserve"> HSM → GCP CMEK migration to completion across 22K+ disks and 400+ teams.</w:t>
       </w:r>
     </w:p>
     <w:p>
@@ -1461,15 +1671,33 @@
           <w:sz w:val="15"/>
           <w:szCs w:val="15"/>
         </w:rPr>
-        <w:t>Increased</w:t>
-      </w:r>
-      <w:r>
-        <w:rPr>
-          <w:rFonts w:asciiTheme="majorHAnsi" w:hAnsiTheme="majorHAnsi" w:cstheme="majorHAnsi"/>
-          <w:sz w:val="15"/>
-          <w:szCs w:val="15"/>
-        </w:rPr>
-        <w:t xml:space="preserve"> total code coverage of the Customer Integration Layer Microservices team’s main repository from 66% to 90% by writing 100+ unit tests</w:t>
+        <w:t>Drove</w:t>
+      </w:r>
+      <w:r>
+        <w:rPr>
+          <w:rFonts w:asciiTheme="majorHAnsi" w:hAnsiTheme="majorHAnsi" w:cstheme="majorHAnsi"/>
+          <w:sz w:val="15"/>
+          <w:szCs w:val="15"/>
+        </w:rPr>
+        <w:t xml:space="preserve"> weekly design forums for the legacy KMS → </w:t>
+      </w:r>
+      <w:proofErr w:type="spellStart"/>
+      <w:r>
+        <w:rPr>
+          <w:rFonts w:asciiTheme="majorHAnsi" w:hAnsiTheme="majorHAnsi" w:cstheme="majorHAnsi"/>
+          <w:sz w:val="15"/>
+          <w:szCs w:val="15"/>
+        </w:rPr>
+        <w:t>HashiCorp</w:t>
+      </w:r>
+      <w:proofErr w:type="spellEnd"/>
+      <w:r>
+        <w:rPr>
+          <w:rFonts w:asciiTheme="majorHAnsi" w:hAnsiTheme="majorHAnsi" w:cstheme="majorHAnsi"/>
+          <w:sz w:val="15"/>
+          <w:szCs w:val="15"/>
+        </w:rPr>
+        <w:t xml:space="preserve"> Vault migration, aligning with senior technical leaders to solve complex issues such as enterprise-wide key sharing and key drift, and translating outcomes into actionable deliverables</w:t>
       </w:r>
     </w:p>
     <w:p>
@@ -1496,7 +1724,31 @@
           <w:sz w:val="15"/>
           <w:szCs w:val="15"/>
         </w:rPr>
-        <w:t>Implemented multiple new DevOps jobs to our CI/CD pipeline with capabilities such as vulnerability detection, branch retrofit automation, and inclusive language detection</w:t>
+        <w:t>Directed</w:t>
+      </w:r>
+      <w:r>
+        <w:rPr>
+          <w:rFonts w:asciiTheme="majorHAnsi" w:hAnsiTheme="majorHAnsi" w:cstheme="majorHAnsi"/>
+          <w:sz w:val="15"/>
+          <w:szCs w:val="15"/>
+        </w:rPr>
+        <w:t xml:space="preserve"> another team in a different organization to develop the </w:t>
+      </w:r>
+      <w:r>
+        <w:rPr>
+          <w:rFonts w:asciiTheme="majorHAnsi" w:hAnsiTheme="majorHAnsi" w:cstheme="majorHAnsi"/>
+          <w:sz w:val="15"/>
+          <w:szCs w:val="15"/>
+        </w:rPr>
+        <w:t xml:space="preserve">KMS </w:t>
+      </w:r>
+      <w:r>
+        <w:rPr>
+          <w:rFonts w:asciiTheme="majorHAnsi" w:hAnsiTheme="majorHAnsi" w:cstheme="majorHAnsi"/>
+          <w:sz w:val="15"/>
+          <w:szCs w:val="15"/>
+        </w:rPr>
+        <w:t>self-service platform, Vault Console</w:t>
       </w:r>
     </w:p>
     <w:p>
@@ -1509,17 +1761,37 @@
         <w:ind w:left="720"/>
         <w:rPr>
           <w:rFonts w:asciiTheme="majorHAnsi" w:hAnsiTheme="majorHAnsi" w:cstheme="majorHAnsi"/>
-          <w:sz w:val="15"/>
-          <w:szCs w:val="15"/>
-        </w:rPr>
-      </w:pPr>
-      <w:r>
-        <w:rPr>
-          <w:rFonts w:asciiTheme="majorHAnsi" w:hAnsiTheme="majorHAnsi" w:cstheme="majorHAnsi"/>
-          <w:sz w:val="15"/>
-          <w:szCs w:val="15"/>
-        </w:rPr>
-        <w:t>Implemented required feature updates to our CRUD endpoints within our microservices</w:t>
+          <w:b/>
+          <w:bCs/>
+          <w:i/>
+          <w:iCs/>
+          <w:sz w:val="15"/>
+          <w:szCs w:val="15"/>
+        </w:rPr>
+      </w:pPr>
+      <w:r>
+        <w:rPr>
+          <w:rFonts w:asciiTheme="majorHAnsi" w:hAnsiTheme="majorHAnsi" w:cstheme="majorHAnsi"/>
+          <w:sz w:val="15"/>
+          <w:szCs w:val="15"/>
+        </w:rPr>
+        <w:t>Interviewed contractors, onboarded, assisted, oversaw, reviewed, and delivered their feature development in our legacy KMS</w:t>
+      </w:r>
+      <w:r>
+        <w:rPr>
+          <w:rFonts w:asciiTheme="majorHAnsi" w:hAnsiTheme="majorHAnsi" w:cstheme="majorHAnsi"/>
+          <w:sz w:val="15"/>
+          <w:szCs w:val="15"/>
+        </w:rPr>
+        <w:t xml:space="preserve"> </w:t>
+      </w:r>
+      <w:r>
+        <w:rPr>
+          <w:rFonts w:asciiTheme="majorHAnsi" w:hAnsiTheme="majorHAnsi" w:cstheme="majorHAnsi"/>
+          <w:sz w:val="15"/>
+          <w:szCs w:val="15"/>
+        </w:rPr>
+        <w:t>to unblock migrations</w:t>
       </w:r>
     </w:p>
     <w:p>
@@ -1542,76 +1814,7 @@
           <w:sz w:val="15"/>
           <w:szCs w:val="15"/>
         </w:rPr>
-        <w:t>Enhanced the performance, security, and maintainability of my team’s repositories by upgrading from .NET 6 to .NET 8</w:t>
-      </w:r>
-    </w:p>
-    <w:p>
-      <w:pPr>
-        <w:rPr>
-          <w:rFonts w:asciiTheme="majorHAnsi" w:hAnsiTheme="majorHAnsi" w:cstheme="majorHAnsi"/>
-          <w:i/>
-          <w:iCs/>
-          <w:sz w:val="15"/>
-          <w:szCs w:val="15"/>
-        </w:rPr>
-      </w:pPr>
-      <w:r>
-        <w:rPr>
-          <w:rFonts w:asciiTheme="majorHAnsi" w:hAnsiTheme="majorHAnsi" w:cstheme="majorHAnsi"/>
-          <w:i/>
-          <w:iCs/>
-          <w:sz w:val="15"/>
-          <w:szCs w:val="15"/>
-        </w:rPr>
-        <w:t xml:space="preserve">Full-Stack Software Engineer </w:t>
-      </w:r>
-      <w:r>
-        <w:rPr>
-          <w:rFonts w:asciiTheme="majorHAnsi" w:hAnsiTheme="majorHAnsi" w:cstheme="majorHAnsi"/>
-          <w:i/>
-          <w:iCs/>
-          <w:sz w:val="15"/>
-          <w:szCs w:val="15"/>
-        </w:rPr>
-        <w:t xml:space="preserve">for the Customer Primary Data team </w:t>
-      </w:r>
-      <w:r>
-        <w:rPr>
-          <w:rFonts w:asciiTheme="majorHAnsi" w:hAnsiTheme="majorHAnsi" w:cstheme="majorHAnsi"/>
-          <w:sz w:val="15"/>
-          <w:szCs w:val="15"/>
-        </w:rPr>
-        <w:t xml:space="preserve">| </w:t>
-      </w:r>
-      <w:r>
-        <w:rPr>
-          <w:rFonts w:asciiTheme="majorHAnsi" w:hAnsiTheme="majorHAnsi" w:cstheme="majorHAnsi"/>
-          <w:i/>
-          <w:iCs/>
-          <w:sz w:val="15"/>
-          <w:szCs w:val="15"/>
-        </w:rPr>
-        <w:t>Part of Dell</w:t>
-      </w:r>
-      <w:r>
-        <w:rPr>
-          <w:rFonts w:asciiTheme="majorHAnsi" w:hAnsiTheme="majorHAnsi" w:cstheme="majorHAnsi"/>
-          <w:i/>
-          <w:iCs/>
-          <w:sz w:val="15"/>
-          <w:szCs w:val="15"/>
-        </w:rPr>
-        <w:t xml:space="preserve"> Digital’s </w:t>
-      </w:r>
-      <w:r>
-        <w:rPr>
-          <w:rFonts w:asciiTheme="majorHAnsi" w:hAnsiTheme="majorHAnsi" w:cstheme="majorHAnsi"/>
-          <w:i/>
-          <w:iCs/>
-          <w:sz w:val="15"/>
-          <w:szCs w:val="15"/>
-        </w:rPr>
-        <w:t>Customer Innovation Council</w:t>
+        <w:t>Built automation and tooling to register applications with Vault and support migrations, including Terraform PR pipelines and idempotent KV migration scripts</w:t>
       </w:r>
     </w:p>
     <w:p>
@@ -1624,29 +1827,33 @@
         <w:ind w:left="720"/>
         <w:rPr>
           <w:rFonts w:asciiTheme="majorHAnsi" w:hAnsiTheme="majorHAnsi" w:cstheme="majorHAnsi"/>
-          <w:b/>
-          <w:bCs/>
-          <w:i/>
-          <w:iCs/>
-          <w:sz w:val="15"/>
-          <w:szCs w:val="15"/>
-        </w:rPr>
-      </w:pPr>
-      <w:r>
-        <w:rPr>
-          <w:rFonts w:asciiTheme="majorHAnsi" w:hAnsiTheme="majorHAnsi" w:cstheme="majorHAnsi"/>
-          <w:sz w:val="15"/>
-          <w:szCs w:val="15"/>
-        </w:rPr>
-        <w:t xml:space="preserve">Implemented the CI/CD pipeline for the teams </w:t>
-      </w:r>
-      <w:r>
-        <w:rPr>
-          <w:rFonts w:asciiTheme="majorHAnsi" w:hAnsiTheme="majorHAnsi" w:cstheme="majorHAnsi"/>
-          <w:sz w:val="15"/>
-          <w:szCs w:val="15"/>
-        </w:rPr>
-        <w:t>AI application</w:t>
+          <w:sz w:val="15"/>
+          <w:szCs w:val="15"/>
+        </w:rPr>
+      </w:pPr>
+      <w:r>
+        <w:rPr>
+          <w:rFonts w:asciiTheme="majorHAnsi" w:hAnsiTheme="majorHAnsi" w:cstheme="majorHAnsi"/>
+          <w:sz w:val="15"/>
+          <w:szCs w:val="15"/>
+        </w:rPr>
+        <w:t xml:space="preserve">Laid the groundwork for enterprise-scale Vault migration across 700+ applications and VMs by creating onboarding playbooks, hosting developer working sessions, and building </w:t>
+      </w:r>
+      <w:r>
+        <w:rPr>
+          <w:rFonts w:asciiTheme="majorHAnsi" w:hAnsiTheme="majorHAnsi" w:cstheme="majorHAnsi"/>
+          <w:sz w:val="15"/>
+          <w:szCs w:val="15"/>
+        </w:rPr>
+        <w:t>a</w:t>
+      </w:r>
+      <w:r>
+        <w:rPr>
+          <w:rFonts w:asciiTheme="majorHAnsi" w:hAnsiTheme="majorHAnsi" w:cstheme="majorHAnsi"/>
+          <w:sz w:val="15"/>
+          <w:szCs w:val="15"/>
+        </w:rPr>
+        <w:t xml:space="preserve"> status board to track readiness across all required pieces.</w:t>
       </w:r>
     </w:p>
     <w:p>
@@ -1673,46 +1880,149 @@
           <w:sz w:val="15"/>
           <w:szCs w:val="15"/>
         </w:rPr>
-        <w:t>Participated in discussions on ways to innovate the Customer organization</w:t>
-      </w:r>
-    </w:p>
-    <w:p>
-      <w:pPr>
-        <w:rPr>
-          <w:rFonts w:asciiTheme="majorHAnsi" w:hAnsiTheme="majorHAnsi" w:cstheme="majorHAnsi"/>
-          <w:i/>
-          <w:iCs/>
-          <w:sz w:val="15"/>
-          <w:szCs w:val="15"/>
-        </w:rPr>
-      </w:pPr>
-      <w:r>
-        <w:rPr>
-          <w:rFonts w:asciiTheme="majorHAnsi" w:hAnsiTheme="majorHAnsi" w:cstheme="majorHAnsi"/>
-          <w:i/>
-          <w:iCs/>
-          <w:sz w:val="15"/>
-          <w:szCs w:val="15"/>
-        </w:rPr>
-        <w:t xml:space="preserve">Member of the Dell Digital NA CIO Regional Council – Career Pillar </w:t>
-      </w:r>
-      <w:r>
-        <w:rPr>
-          <w:rFonts w:asciiTheme="majorHAnsi" w:hAnsiTheme="majorHAnsi" w:cstheme="majorHAnsi"/>
-          <w:sz w:val="15"/>
-          <w:szCs w:val="15"/>
-        </w:rPr>
-        <w:t xml:space="preserve">| </w:t>
-      </w:r>
-      <w:r>
-        <w:rPr>
-          <w:rFonts w:asciiTheme="majorHAnsi" w:hAnsiTheme="majorHAnsi" w:cstheme="majorHAnsi"/>
-          <w:i/>
-          <w:iCs/>
-          <w:sz w:val="15"/>
-          <w:szCs w:val="15"/>
-        </w:rPr>
-        <w:t xml:space="preserve">This council plans career-oriented events in North America for the Dell Digital organization </w:t>
+        <w:t>L2 developer support, assisting developers with integrating with our legacy KMS</w:t>
+      </w:r>
+    </w:p>
+    <w:p>
+      <w:pPr>
+        <w:rPr>
+          <w:rFonts w:asciiTheme="majorHAnsi" w:hAnsiTheme="majorHAnsi" w:cstheme="majorHAnsi"/>
+          <w:b/>
+          <w:bCs/>
+          <w:i/>
+          <w:iCs/>
+          <w:sz w:val="11"/>
+          <w:szCs w:val="11"/>
+        </w:rPr>
+      </w:pPr>
+    </w:p>
+    <w:p>
+      <w:pPr>
+        <w:tabs>
+          <w:tab w:val="left" w:pos="8820"/>
+        </w:tabs>
+        <w:ind w:left="720" w:hanging="720"/>
+        <w:jc w:val="both"/>
+        <w:rPr>
+          <w:rFonts w:ascii="Times New Roman" w:hAnsi="Times New Roman" w:cs="Times New Roman"/>
+          <w:b/>
+          <w:bCs/>
+          <w:i/>
+          <w:iCs/>
+          <w:sz w:val="18"/>
+          <w:szCs w:val="18"/>
+        </w:rPr>
+      </w:pPr>
+      <w:r>
+        <w:rPr>
+          <w:rFonts w:ascii="Times New Roman" w:hAnsi="Times New Roman" w:cs="Times New Roman"/>
+          <w:b/>
+          <w:bCs/>
+          <w:i/>
+          <w:iCs/>
+          <w:sz w:val="18"/>
+          <w:szCs w:val="18"/>
+        </w:rPr>
+        <w:t>Software Engineer 1</w:t>
+      </w:r>
+      <w:r>
+        <w:rPr>
+          <w:rFonts w:ascii="Times New Roman" w:hAnsi="Times New Roman" w:cs="Times New Roman"/>
+          <w:b/>
+          <w:bCs/>
+          <w:i/>
+          <w:iCs/>
+          <w:sz w:val="18"/>
+          <w:szCs w:val="18"/>
+        </w:rPr>
+        <w:t xml:space="preserve"> / </w:t>
+      </w:r>
+      <w:r>
+        <w:rPr>
+          <w:rFonts w:ascii="Times New Roman" w:hAnsi="Times New Roman" w:cs="Times New Roman"/>
+          <w:b/>
+          <w:bCs/>
+          <w:i/>
+          <w:iCs/>
+          <w:sz w:val="18"/>
+          <w:szCs w:val="18"/>
+        </w:rPr>
+        <w:t>Dell Technologies, Round Rock, Texas</w:t>
+      </w:r>
+      <w:r>
+        <w:rPr>
+          <w:rFonts w:ascii="Times New Roman" w:hAnsi="Times New Roman" w:cs="Times New Roman"/>
+          <w:b/>
+          <w:bCs/>
+          <w:i/>
+          <w:iCs/>
+          <w:sz w:val="18"/>
+          <w:szCs w:val="18"/>
+        </w:rPr>
+        <w:tab/>
+        <w:t xml:space="preserve">08/2023 </w:t>
+      </w:r>
+      <w:r>
+        <w:rPr>
+          <w:rFonts w:ascii="Times New Roman" w:hAnsi="Times New Roman" w:cs="Times New Roman"/>
+          <w:b/>
+          <w:bCs/>
+          <w:i/>
+          <w:iCs/>
+          <w:sz w:val="18"/>
+          <w:szCs w:val="18"/>
+        </w:rPr>
+        <w:t>–</w:t>
+      </w:r>
+      <w:r>
+        <w:rPr>
+          <w:rFonts w:ascii="Times New Roman" w:hAnsi="Times New Roman" w:cs="Times New Roman"/>
+          <w:b/>
+          <w:bCs/>
+          <w:i/>
+          <w:iCs/>
+          <w:sz w:val="18"/>
+          <w:szCs w:val="18"/>
+        </w:rPr>
+        <w:t xml:space="preserve"> </w:t>
+      </w:r>
+      <w:r>
+        <w:rPr>
+          <w:rFonts w:ascii="Times New Roman" w:hAnsi="Times New Roman" w:cs="Times New Roman"/>
+          <w:b/>
+          <w:bCs/>
+          <w:i/>
+          <w:iCs/>
+          <w:sz w:val="18"/>
+          <w:szCs w:val="18"/>
+        </w:rPr>
+        <w:t>09/2024</w:t>
+      </w:r>
+    </w:p>
+    <w:p>
+      <w:pPr>
+        <w:tabs>
+          <w:tab w:val="left" w:pos="8820"/>
+        </w:tabs>
+        <w:ind w:left="720" w:hanging="720"/>
+        <w:jc w:val="both"/>
+        <w:rPr>
+          <w:rFonts w:ascii="Times New Roman" w:hAnsi="Times New Roman" w:cs="Times New Roman"/>
+          <w:i/>
+          <w:iCs/>
+          <w:sz w:val="15"/>
+          <w:szCs w:val="15"/>
+        </w:rPr>
+      </w:pPr>
+      <w:r>
+        <w:rPr>
+          <w:rFonts w:ascii="Times New Roman" w:hAnsi="Times New Roman" w:cs="Times New Roman"/>
+          <w:i/>
+          <w:iCs/>
+          <w:sz w:val="15"/>
+          <w:szCs w:val="15"/>
+        </w:rPr>
+        <w:t>Backend Software Engineer on the Customer Integration Layer Microservices team | Part of the ITDP (IT Development Program, a rotational program for new grads)</w:t>
       </w:r>
     </w:p>
     <w:p>
@@ -1739,6 +2049,351 @@
           <w:sz w:val="15"/>
           <w:szCs w:val="15"/>
         </w:rPr>
+        <w:t xml:space="preserve">Remediated 100+ vulnerabilities across all my teams’ repositories. </w:t>
+      </w:r>
+      <w:r>
+        <w:rPr>
+          <w:rFonts w:asciiTheme="majorHAnsi" w:hAnsiTheme="majorHAnsi" w:cstheme="majorHAnsi"/>
+          <w:sz w:val="15"/>
+          <w:szCs w:val="15"/>
+        </w:rPr>
+        <w:t>Reduced</w:t>
+      </w:r>
+      <w:r>
+        <w:rPr>
+          <w:rFonts w:asciiTheme="majorHAnsi" w:hAnsiTheme="majorHAnsi" w:cstheme="majorHAnsi"/>
+          <w:sz w:val="15"/>
+          <w:szCs w:val="15"/>
+        </w:rPr>
+        <w:t xml:space="preserve"> total vulnerabilities reported</w:t>
+      </w:r>
+      <w:r>
+        <w:rPr>
+          <w:rFonts w:asciiTheme="majorHAnsi" w:hAnsiTheme="majorHAnsi" w:cstheme="majorHAnsi"/>
+          <w:sz w:val="15"/>
+          <w:szCs w:val="15"/>
+        </w:rPr>
+        <w:t xml:space="preserve"> locally</w:t>
+      </w:r>
+      <w:r>
+        <w:rPr>
+          <w:rFonts w:asciiTheme="majorHAnsi" w:hAnsiTheme="majorHAnsi" w:cstheme="majorHAnsi"/>
+          <w:sz w:val="15"/>
+          <w:szCs w:val="15"/>
+        </w:rPr>
+        <w:t xml:space="preserve"> to 0%</w:t>
+      </w:r>
+      <w:r>
+        <w:rPr>
+          <w:rFonts w:asciiTheme="majorHAnsi" w:hAnsiTheme="majorHAnsi" w:cstheme="majorHAnsi"/>
+          <w:sz w:val="15"/>
+          <w:szCs w:val="15"/>
+        </w:rPr>
+        <w:t xml:space="preserve"> </w:t>
+      </w:r>
+    </w:p>
+    <w:p>
+      <w:pPr>
+        <w:pStyle w:val="ListParagraph"/>
+        <w:numPr>
+          <w:ilvl w:val="1"/>
+          <w:numId w:val="6"/>
+        </w:numPr>
+        <w:ind w:left="720"/>
+        <w:rPr>
+          <w:rFonts w:asciiTheme="majorHAnsi" w:hAnsiTheme="majorHAnsi" w:cstheme="majorHAnsi"/>
+          <w:b/>
+          <w:bCs/>
+          <w:i/>
+          <w:iCs/>
+          <w:sz w:val="15"/>
+          <w:szCs w:val="15"/>
+        </w:rPr>
+      </w:pPr>
+      <w:r>
+        <w:rPr>
+          <w:rFonts w:asciiTheme="majorHAnsi" w:hAnsiTheme="majorHAnsi" w:cstheme="majorHAnsi"/>
+          <w:sz w:val="15"/>
+          <w:szCs w:val="15"/>
+        </w:rPr>
+        <w:t>Increased</w:t>
+      </w:r>
+      <w:r>
+        <w:rPr>
+          <w:rFonts w:asciiTheme="majorHAnsi" w:hAnsiTheme="majorHAnsi" w:cstheme="majorHAnsi"/>
+          <w:sz w:val="15"/>
+          <w:szCs w:val="15"/>
+        </w:rPr>
+        <w:t xml:space="preserve"> total code coverage of the Customer Integration Layer Microservices team’s main repository from 66% to 90% by writing 100+ unit tests</w:t>
+      </w:r>
+    </w:p>
+    <w:p>
+      <w:pPr>
+        <w:pStyle w:val="ListParagraph"/>
+        <w:numPr>
+          <w:ilvl w:val="1"/>
+          <w:numId w:val="6"/>
+        </w:numPr>
+        <w:ind w:left="720"/>
+        <w:rPr>
+          <w:rFonts w:asciiTheme="majorHAnsi" w:hAnsiTheme="majorHAnsi" w:cstheme="majorHAnsi"/>
+          <w:b/>
+          <w:bCs/>
+          <w:i/>
+          <w:iCs/>
+          <w:sz w:val="15"/>
+          <w:szCs w:val="15"/>
+        </w:rPr>
+      </w:pPr>
+      <w:r>
+        <w:rPr>
+          <w:rFonts w:asciiTheme="majorHAnsi" w:hAnsiTheme="majorHAnsi" w:cstheme="majorHAnsi"/>
+          <w:sz w:val="15"/>
+          <w:szCs w:val="15"/>
+        </w:rPr>
+        <w:t>Implemented multiple new DevOps jobs to our CI/CD pipeline with capabilities such as vulnerability detection and inclusive language detection</w:t>
+      </w:r>
+    </w:p>
+    <w:p>
+      <w:pPr>
+        <w:pStyle w:val="ListParagraph"/>
+        <w:numPr>
+          <w:ilvl w:val="1"/>
+          <w:numId w:val="6"/>
+        </w:numPr>
+        <w:ind w:left="720"/>
+        <w:rPr>
+          <w:rFonts w:asciiTheme="majorHAnsi" w:hAnsiTheme="majorHAnsi" w:cstheme="majorHAnsi"/>
+          <w:sz w:val="15"/>
+          <w:szCs w:val="15"/>
+        </w:rPr>
+      </w:pPr>
+      <w:r>
+        <w:rPr>
+          <w:rFonts w:asciiTheme="majorHAnsi" w:hAnsiTheme="majorHAnsi" w:cstheme="majorHAnsi"/>
+          <w:sz w:val="15"/>
+          <w:szCs w:val="15"/>
+        </w:rPr>
+        <w:t>Implemented required feature updates to our CRUD endpoints within our microservices</w:t>
+      </w:r>
+    </w:p>
+    <w:p>
+      <w:pPr>
+        <w:pStyle w:val="ListParagraph"/>
+        <w:numPr>
+          <w:ilvl w:val="1"/>
+          <w:numId w:val="6"/>
+        </w:numPr>
+        <w:ind w:left="720"/>
+        <w:rPr>
+          <w:rFonts w:asciiTheme="majorHAnsi" w:hAnsiTheme="majorHAnsi" w:cstheme="majorHAnsi"/>
+          <w:sz w:val="15"/>
+          <w:szCs w:val="15"/>
+        </w:rPr>
+      </w:pPr>
+      <w:r>
+        <w:rPr>
+          <w:rFonts w:asciiTheme="majorHAnsi" w:hAnsiTheme="majorHAnsi" w:cstheme="majorHAnsi"/>
+          <w:sz w:val="15"/>
+          <w:szCs w:val="15"/>
+        </w:rPr>
+        <w:t>Enhanced the performance, security, and maintainability of my team’s repositories by upgrading from .NET 6 to .NET 8</w:t>
+      </w:r>
+    </w:p>
+    <w:p>
+      <w:pPr>
+        <w:rPr>
+          <w:rFonts w:asciiTheme="majorHAnsi" w:hAnsiTheme="majorHAnsi" w:cstheme="majorHAnsi"/>
+          <w:i/>
+          <w:iCs/>
+          <w:sz w:val="15"/>
+          <w:szCs w:val="15"/>
+        </w:rPr>
+      </w:pPr>
+      <w:r>
+        <w:rPr>
+          <w:rFonts w:asciiTheme="majorHAnsi" w:hAnsiTheme="majorHAnsi" w:cstheme="majorHAnsi"/>
+          <w:i/>
+          <w:iCs/>
+          <w:sz w:val="15"/>
+          <w:szCs w:val="15"/>
+        </w:rPr>
+        <w:t xml:space="preserve">Full-Stack Software Engineer </w:t>
+      </w:r>
+      <w:r>
+        <w:rPr>
+          <w:rFonts w:asciiTheme="majorHAnsi" w:hAnsiTheme="majorHAnsi" w:cstheme="majorHAnsi"/>
+          <w:i/>
+          <w:iCs/>
+          <w:sz w:val="15"/>
+          <w:szCs w:val="15"/>
+        </w:rPr>
+        <w:t xml:space="preserve">for the Customer Primary Data team </w:t>
+      </w:r>
+      <w:r>
+        <w:rPr>
+          <w:rFonts w:asciiTheme="majorHAnsi" w:hAnsiTheme="majorHAnsi" w:cstheme="majorHAnsi"/>
+          <w:sz w:val="15"/>
+          <w:szCs w:val="15"/>
+        </w:rPr>
+        <w:t xml:space="preserve">| </w:t>
+      </w:r>
+      <w:r>
+        <w:rPr>
+          <w:rFonts w:asciiTheme="majorHAnsi" w:hAnsiTheme="majorHAnsi" w:cstheme="majorHAnsi"/>
+          <w:i/>
+          <w:iCs/>
+          <w:sz w:val="15"/>
+          <w:szCs w:val="15"/>
+        </w:rPr>
+        <w:t>Part of Dell</w:t>
+      </w:r>
+      <w:r>
+        <w:rPr>
+          <w:rFonts w:asciiTheme="majorHAnsi" w:hAnsiTheme="majorHAnsi" w:cstheme="majorHAnsi"/>
+          <w:i/>
+          <w:iCs/>
+          <w:sz w:val="15"/>
+          <w:szCs w:val="15"/>
+        </w:rPr>
+        <w:t xml:space="preserve"> Digital’s </w:t>
+      </w:r>
+      <w:r>
+        <w:rPr>
+          <w:rFonts w:asciiTheme="majorHAnsi" w:hAnsiTheme="majorHAnsi" w:cstheme="majorHAnsi"/>
+          <w:i/>
+          <w:iCs/>
+          <w:sz w:val="15"/>
+          <w:szCs w:val="15"/>
+        </w:rPr>
+        <w:t>Customer Innovation Council</w:t>
+      </w:r>
+    </w:p>
+    <w:p>
+      <w:pPr>
+        <w:pStyle w:val="ListParagraph"/>
+        <w:numPr>
+          <w:ilvl w:val="1"/>
+          <w:numId w:val="6"/>
+        </w:numPr>
+        <w:ind w:left="720"/>
+        <w:rPr>
+          <w:rFonts w:asciiTheme="majorHAnsi" w:hAnsiTheme="majorHAnsi" w:cstheme="majorHAnsi"/>
+          <w:b/>
+          <w:bCs/>
+          <w:i/>
+          <w:iCs/>
+          <w:sz w:val="15"/>
+          <w:szCs w:val="15"/>
+        </w:rPr>
+      </w:pPr>
+      <w:r>
+        <w:rPr>
+          <w:rFonts w:asciiTheme="majorHAnsi" w:hAnsiTheme="majorHAnsi" w:cstheme="majorHAnsi"/>
+          <w:sz w:val="15"/>
+          <w:szCs w:val="15"/>
+        </w:rPr>
+        <w:t xml:space="preserve">Implemented the CI/CD pipeline for the teams </w:t>
+      </w:r>
+      <w:r>
+        <w:rPr>
+          <w:rFonts w:asciiTheme="majorHAnsi" w:hAnsiTheme="majorHAnsi" w:cstheme="majorHAnsi"/>
+          <w:sz w:val="15"/>
+          <w:szCs w:val="15"/>
+        </w:rPr>
+        <w:t>AI application</w:t>
+      </w:r>
+    </w:p>
+    <w:p>
+      <w:pPr>
+        <w:pStyle w:val="ListParagraph"/>
+        <w:numPr>
+          <w:ilvl w:val="1"/>
+          <w:numId w:val="6"/>
+        </w:numPr>
+        <w:ind w:left="720"/>
+        <w:rPr>
+          <w:rFonts w:asciiTheme="majorHAnsi" w:hAnsiTheme="majorHAnsi" w:cstheme="majorHAnsi"/>
+          <w:b/>
+          <w:bCs/>
+          <w:i/>
+          <w:iCs/>
+          <w:sz w:val="15"/>
+          <w:szCs w:val="15"/>
+        </w:rPr>
+      </w:pPr>
+      <w:r>
+        <w:rPr>
+          <w:rFonts w:asciiTheme="majorHAnsi" w:hAnsiTheme="majorHAnsi" w:cstheme="majorHAnsi"/>
+          <w:sz w:val="15"/>
+          <w:szCs w:val="15"/>
+        </w:rPr>
+        <w:t>Participated in discussions on ways to innovate the Customer organization</w:t>
+      </w:r>
+    </w:p>
+    <w:p>
+      <w:pPr>
+        <w:rPr>
+          <w:rFonts w:asciiTheme="majorHAnsi" w:hAnsiTheme="majorHAnsi" w:cstheme="majorHAnsi"/>
+          <w:i/>
+          <w:iCs/>
+          <w:sz w:val="15"/>
+          <w:szCs w:val="15"/>
+        </w:rPr>
+      </w:pPr>
+      <w:r>
+        <w:rPr>
+          <w:rFonts w:asciiTheme="majorHAnsi" w:hAnsiTheme="majorHAnsi" w:cstheme="majorHAnsi"/>
+          <w:i/>
+          <w:iCs/>
+          <w:sz w:val="15"/>
+          <w:szCs w:val="15"/>
+        </w:rPr>
+        <w:t xml:space="preserve">Member of the Dell Digital NA CIO Regional Council – Career Pillar </w:t>
+      </w:r>
+      <w:r>
+        <w:rPr>
+          <w:rFonts w:asciiTheme="majorHAnsi" w:hAnsiTheme="majorHAnsi" w:cstheme="majorHAnsi"/>
+          <w:sz w:val="15"/>
+          <w:szCs w:val="15"/>
+        </w:rPr>
+        <w:t xml:space="preserve">| </w:t>
+      </w:r>
+      <w:r>
+        <w:rPr>
+          <w:rFonts w:asciiTheme="majorHAnsi" w:hAnsiTheme="majorHAnsi" w:cstheme="majorHAnsi"/>
+          <w:i/>
+          <w:iCs/>
+          <w:sz w:val="15"/>
+          <w:szCs w:val="15"/>
+        </w:rPr>
+        <w:t xml:space="preserve">This council plans career-oriented events in North America for the Dell Digital organization </w:t>
+      </w:r>
+    </w:p>
+    <w:p>
+      <w:pPr>
+        <w:pStyle w:val="ListParagraph"/>
+        <w:numPr>
+          <w:ilvl w:val="1"/>
+          <w:numId w:val="6"/>
+        </w:numPr>
+        <w:ind w:left="720"/>
+        <w:rPr>
+          <w:rFonts w:asciiTheme="majorHAnsi" w:hAnsiTheme="majorHAnsi" w:cstheme="majorHAnsi"/>
+          <w:b/>
+          <w:bCs/>
+          <w:i/>
+          <w:iCs/>
+          <w:sz w:val="15"/>
+          <w:szCs w:val="15"/>
+        </w:rPr>
+      </w:pPr>
+      <w:r>
+        <w:rPr>
+          <w:rFonts w:asciiTheme="majorHAnsi" w:hAnsiTheme="majorHAnsi" w:cstheme="majorHAnsi"/>
+          <w:sz w:val="15"/>
+          <w:szCs w:val="15"/>
+        </w:rPr>
         <w:t>Assisted in the planning of events such as “Pancakes with leaders” and the “2</w:t>
       </w:r>
       <w:r>
@@ -1761,7 +2416,6 @@
     </w:p>
     <w:p>
       <w:pPr>
-        <w:pStyle w:val="ListParagraph"/>
         <w:rPr>
           <w:rFonts w:asciiTheme="majorHAnsi" w:hAnsiTheme="majorHAnsi" w:cstheme="majorHAnsi"/>
           <w:sz w:val="11"/>
@@ -1906,23 +2560,7 @@
           <w:sz w:val="15"/>
           <w:szCs w:val="15"/>
         </w:rPr>
-        <w:t>Created a .NET MAUI cross-platform mobile application for the organization that when enabled on an employee’s phone, sends their location via MQTT to be visualized in our situational awareness tool.</w:t>
-      </w:r>
-      <w:r>
-        <w:rPr>
-          <w:rFonts w:asciiTheme="majorHAnsi" w:hAnsiTheme="majorHAnsi" w:cstheme="majorHAnsi"/>
-          <w:sz w:val="15"/>
-          <w:szCs w:val="15"/>
-        </w:rPr>
-        <w:t xml:space="preserve"> This mobile application worked as a background process to constantly publish location data.</w:t>
-      </w:r>
-      <w:r>
-        <w:rPr>
-          <w:rFonts w:asciiTheme="majorHAnsi" w:hAnsiTheme="majorHAnsi" w:cstheme="majorHAnsi"/>
-          <w:sz w:val="15"/>
-          <w:szCs w:val="15"/>
-        </w:rPr>
-        <w:t xml:space="preserve"> Location transmission is enabled and disabled at the press of a button.</w:t>
+        <w:t>Built a .NET MAUI background mobile app that streams employee location via MQTT to a situational-awareness platform; one-tap enable/disable.</w:t>
       </w:r>
     </w:p>
     <w:p>
@@ -1946,23 +2584,15 @@
           <w:sz w:val="15"/>
           <w:szCs w:val="15"/>
         </w:rPr>
-        <w:t>P</w:t>
-      </w:r>
-      <w:r>
-        <w:rPr>
-          <w:rFonts w:asciiTheme="majorHAnsi" w:hAnsiTheme="majorHAnsi" w:cstheme="majorHAnsi"/>
-          <w:sz w:val="15"/>
-          <w:szCs w:val="15"/>
-        </w:rPr>
-        <w:t xml:space="preserve">roposed and implemented a mission critical UAS status page </w:t>
-      </w:r>
-      <w:r>
-        <w:rPr>
-          <w:rFonts w:asciiTheme="majorHAnsi" w:hAnsiTheme="majorHAnsi" w:cstheme="majorHAnsi"/>
-          <w:sz w:val="15"/>
-          <w:szCs w:val="15"/>
-        </w:rPr>
-        <w:t>that displays the live critical information of all active UAS aircrafts such as battery %, ground speed, and altitude. This page had custom alert capabilities that a user could set thresholds for max speed, max altitude, min altitude, and min battery %. The thresholds could be set both globally and per aircraft, and these thresholds could be saved to a cookie. When a threshold was hit, the UAS information for that aircraft would turn red and a toast would appear with an appropriate danger message.</w:t>
+        <w:t>Shipped a UAS live-status dashboard (battery%, speed, altitude) with per-aircraft/global thresholding, persisted settings, and real-time alerting.</w:t>
+      </w:r>
+      <w:r>
+        <w:rPr>
+          <w:rFonts w:asciiTheme="majorHAnsi" w:hAnsiTheme="majorHAnsi" w:cstheme="majorHAnsi"/>
+          <w:sz w:val="15"/>
+          <w:szCs w:val="15"/>
+        </w:rPr>
+        <w:t xml:space="preserve"> </w:t>
       </w:r>
     </w:p>
     <w:p>
@@ -1986,15 +2616,15 @@
           <w:sz w:val="15"/>
           <w:szCs w:val="15"/>
         </w:rPr>
-        <w:t>Pair-programmed on the creation of an MQTT client logging system to log all topics published to our ActiveMQ server along with a replay system to replay any selected message.</w:t>
-      </w:r>
-      <w:r>
-        <w:rPr>
-          <w:rFonts w:asciiTheme="majorHAnsi" w:hAnsiTheme="majorHAnsi" w:cstheme="majorHAnsi"/>
-          <w:sz w:val="15"/>
-          <w:szCs w:val="15"/>
-        </w:rPr>
-        <w:t xml:space="preserve"> Both the logging and replay systems utilized multi-threading.</w:t>
+        <w:t>D</w:t>
+      </w:r>
+      <w:r>
+        <w:rPr>
+          <w:rFonts w:asciiTheme="majorHAnsi" w:hAnsiTheme="majorHAnsi" w:cstheme="majorHAnsi"/>
+          <w:sz w:val="15"/>
+          <w:szCs w:val="15"/>
+        </w:rPr>
+        <w:t>eveloped multi-threaded MQTT/ActiveMQ tooling (traffic logger + replay) and a Node.js simulator service that generates configurable event streams.</w:t>
       </w:r>
     </w:p>
     <w:p>
@@ -2018,7 +2648,7 @@
           <w:sz w:val="15"/>
           <w:szCs w:val="15"/>
         </w:rPr>
-        <w:t>Created a NodeJS server application to receive a configuration message from our web application to then produce and publish the requested amount simulations for each simulation type specified from the configuration received to be sent to our situational awareness tool.</w:t>
+        <w:t>Created a new ASP.NET Core MVC web application with Authentication / Authorization / Impersonation capabilities using Microsoft Identity and Entity Framework.</w:t>
       </w:r>
     </w:p>
     <w:p>
@@ -2042,7 +2672,72 @@
           <w:sz w:val="15"/>
           <w:szCs w:val="15"/>
         </w:rPr>
-        <w:t>Created a new ASP.NET Core MVC web application with Authentication / Authorization / Impersonation capabilities using Microsoft Identity and Entity Framework.</w:t>
+        <w:t>Implemented new CRUD operations for new tables in our database with stored procedures, new endpoints in our API, and controls and visuals in our web UI.</w:t>
+      </w:r>
+    </w:p>
+    <w:p>
+      <w:pPr>
+        <w:pStyle w:val="ListParagraph"/>
+        <w:jc w:val="both"/>
+        <w:rPr>
+          <w:rFonts w:asciiTheme="majorHAnsi" w:hAnsiTheme="majorHAnsi" w:cstheme="majorHAnsi"/>
+          <w:sz w:val="11"/>
+          <w:szCs w:val="11"/>
+        </w:rPr>
+      </w:pPr>
+    </w:p>
+    <w:p>
+      <w:pPr>
+        <w:tabs>
+          <w:tab w:val="left" w:pos="8820"/>
+        </w:tabs>
+        <w:ind w:left="720" w:hanging="720"/>
+        <w:jc w:val="both"/>
+        <w:rPr>
+          <w:rFonts w:ascii="Times New Roman" w:hAnsi="Times New Roman" w:cs="Times New Roman"/>
+          <w:b/>
+          <w:bCs/>
+          <w:i/>
+          <w:iCs/>
+          <w:sz w:val="18"/>
+          <w:szCs w:val="18"/>
+        </w:rPr>
+      </w:pPr>
+      <w:r>
+        <w:rPr>
+          <w:rFonts w:ascii="Times New Roman" w:hAnsi="Times New Roman" w:cs="Times New Roman"/>
+          <w:b/>
+          <w:bCs/>
+          <w:i/>
+          <w:iCs/>
+          <w:sz w:val="18"/>
+          <w:szCs w:val="18"/>
+        </w:rPr>
+        <w:t>Owner / Carver Tech LLC</w:t>
+      </w:r>
+      <w:r>
+        <w:rPr>
+          <w:rFonts w:ascii="Times New Roman" w:hAnsi="Times New Roman" w:cs="Times New Roman"/>
+          <w:b/>
+          <w:bCs/>
+          <w:i/>
+          <w:iCs/>
+          <w:sz w:val="18"/>
+          <w:szCs w:val="18"/>
+        </w:rPr>
+        <w:tab/>
+      </w:r>
+      <w:r>
+        <w:rPr>
+          <w:rFonts w:ascii="Times New Roman" w:hAnsi="Times New Roman" w:cs="Times New Roman"/>
+          <w:b/>
+          <w:bCs/>
+          <w:i/>
+          <w:iCs/>
+          <w:sz w:val="18"/>
+          <w:szCs w:val="18"/>
+        </w:rPr>
+        <w:t>02/2022 – Present</w:t>
       </w:r>
     </w:p>
     <w:p>
@@ -2053,148 +2748,51 @@
           <w:numId w:val="6"/>
         </w:numPr>
         <w:ind w:left="720"/>
-        <w:jc w:val="both"/>
-        <w:rPr>
-          <w:rFonts w:asciiTheme="majorHAnsi" w:hAnsiTheme="majorHAnsi" w:cstheme="majorHAnsi"/>
-          <w:sz w:val="15"/>
-          <w:szCs w:val="15"/>
-        </w:rPr>
-      </w:pPr>
-      <w:r>
-        <w:rPr>
-          <w:rFonts w:asciiTheme="majorHAnsi" w:hAnsiTheme="majorHAnsi" w:cstheme="majorHAnsi"/>
-          <w:sz w:val="15"/>
-          <w:szCs w:val="15"/>
-        </w:rPr>
-        <w:t>Created database modification and visualization capabilities in our web application by creating stored procedures, endpoints in our internal RESTful API, and calls to those endpoints.</w:t>
-      </w:r>
-    </w:p>
-    <w:p>
-      <w:pPr>
-        <w:pStyle w:val="ListParagraph"/>
-        <w:jc w:val="both"/>
-        <w:rPr>
-          <w:rFonts w:asciiTheme="majorHAnsi" w:hAnsiTheme="majorHAnsi" w:cstheme="majorHAnsi"/>
-          <w:sz w:val="11"/>
-          <w:szCs w:val="11"/>
-        </w:rPr>
-      </w:pPr>
-    </w:p>
-    <w:p>
-      <w:pPr>
-        <w:tabs>
-          <w:tab w:val="left" w:pos="8820"/>
-        </w:tabs>
-        <w:ind w:left="720" w:hanging="720"/>
-        <w:jc w:val="both"/>
-        <w:rPr>
-          <w:rFonts w:ascii="Times New Roman" w:hAnsi="Times New Roman" w:cs="Times New Roman"/>
-          <w:b/>
-          <w:bCs/>
-          <w:i/>
-          <w:iCs/>
-          <w:sz w:val="18"/>
-          <w:szCs w:val="18"/>
-        </w:rPr>
-      </w:pPr>
-      <w:r>
-        <w:rPr>
-          <w:rFonts w:ascii="Times New Roman" w:hAnsi="Times New Roman" w:cs="Times New Roman"/>
-          <w:b/>
-          <w:bCs/>
-          <w:i/>
-          <w:iCs/>
-          <w:sz w:val="18"/>
-          <w:szCs w:val="18"/>
-        </w:rPr>
-        <w:t>Owner / Carver Tech LLC</w:t>
-      </w:r>
-      <w:r>
-        <w:rPr>
-          <w:rFonts w:ascii="Times New Roman" w:hAnsi="Times New Roman" w:cs="Times New Roman"/>
-          <w:b/>
-          <w:bCs/>
-          <w:i/>
-          <w:iCs/>
-          <w:sz w:val="18"/>
-          <w:szCs w:val="18"/>
-        </w:rPr>
-        <w:tab/>
-      </w:r>
-      <w:r>
-        <w:rPr>
-          <w:rFonts w:ascii="Times New Roman" w:hAnsi="Times New Roman" w:cs="Times New Roman"/>
-          <w:b/>
-          <w:bCs/>
-          <w:i/>
-          <w:iCs/>
-          <w:sz w:val="18"/>
-          <w:szCs w:val="18"/>
-        </w:rPr>
-        <w:t>02/2022 – Present</w:t>
-      </w:r>
-    </w:p>
-    <w:p>
-      <w:pPr>
-        <w:pStyle w:val="ListParagraph"/>
-        <w:numPr>
-          <w:ilvl w:val="1"/>
-          <w:numId w:val="6"/>
-        </w:numPr>
-        <w:ind w:left="720"/>
-        <w:jc w:val="both"/>
-        <w:rPr>
-          <w:rFonts w:asciiTheme="majorHAnsi" w:hAnsiTheme="majorHAnsi" w:cstheme="majorHAnsi"/>
-          <w:sz w:val="15"/>
-          <w:szCs w:val="15"/>
-        </w:rPr>
-      </w:pPr>
-      <w:r>
-        <w:rPr>
-          <w:rFonts w:asciiTheme="majorHAnsi" w:hAnsiTheme="majorHAnsi" w:cstheme="majorHAnsi"/>
-          <w:sz w:val="15"/>
-          <w:szCs w:val="15"/>
-        </w:rPr>
-        <w:t>Built and maintain</w:t>
-      </w:r>
-      <w:r>
-        <w:rPr>
-          <w:rFonts w:asciiTheme="majorHAnsi" w:hAnsiTheme="majorHAnsi" w:cstheme="majorHAnsi"/>
-          <w:sz w:val="15"/>
-          <w:szCs w:val="15"/>
-        </w:rPr>
-        <w:t>ed</w:t>
-      </w:r>
-      <w:r>
-        <w:rPr>
-          <w:rFonts w:asciiTheme="majorHAnsi" w:hAnsiTheme="majorHAnsi" w:cstheme="majorHAnsi"/>
-          <w:sz w:val="15"/>
-          <w:szCs w:val="15"/>
-        </w:rPr>
-        <w:t xml:space="preserve"> a 240 MH/s cryptocurrency mining rig to validate the Ethereum blockchain via the proof of work consensus protocol.</w:t>
-      </w:r>
-    </w:p>
-    <w:p>
-      <w:pPr>
-        <w:pStyle w:val="ListParagraph"/>
-        <w:numPr>
-          <w:ilvl w:val="1"/>
-          <w:numId w:val="6"/>
-        </w:numPr>
-        <w:ind w:left="720"/>
-        <w:rPr>
-          <w:rFonts w:asciiTheme="majorHAnsi" w:hAnsiTheme="majorHAnsi" w:cstheme="majorHAnsi"/>
-          <w:sz w:val="15"/>
-          <w:szCs w:val="15"/>
-        </w:rPr>
-      </w:pPr>
-      <w:r>
-        <w:rPr>
-          <w:rFonts w:asciiTheme="majorHAnsi" w:hAnsiTheme="majorHAnsi" w:cstheme="majorHAnsi"/>
-          <w:sz w:val="15"/>
-          <w:szCs w:val="15"/>
-        </w:rPr>
-        <w:t>Created a Review management system with a dashboard that tracked every review for compan</w:t>
+        <w:rPr>
+          <w:rFonts w:asciiTheme="majorHAnsi" w:hAnsiTheme="majorHAnsi" w:cstheme="majorHAnsi"/>
+          <w:sz w:val="15"/>
+          <w:szCs w:val="15"/>
+        </w:rPr>
+      </w:pPr>
+      <w:r>
+        <w:rPr>
+          <w:rFonts w:asciiTheme="majorHAnsi" w:hAnsiTheme="majorHAnsi" w:cstheme="majorHAnsi"/>
+          <w:sz w:val="15"/>
+          <w:szCs w:val="15"/>
+        </w:rPr>
+        <w:t xml:space="preserve">Created a Review management </w:t>
+      </w:r>
+      <w:r>
+        <w:rPr>
+          <w:rFonts w:asciiTheme="majorHAnsi" w:hAnsiTheme="majorHAnsi" w:cstheme="majorHAnsi"/>
+          <w:sz w:val="15"/>
+          <w:szCs w:val="15"/>
+        </w:rPr>
+        <w:t>SaaS</w:t>
+      </w:r>
+      <w:r>
+        <w:rPr>
+          <w:rFonts w:asciiTheme="majorHAnsi" w:hAnsiTheme="majorHAnsi" w:cstheme="majorHAnsi"/>
+          <w:sz w:val="15"/>
+          <w:szCs w:val="15"/>
+        </w:rPr>
+        <w:t xml:space="preserve"> with a dashboard that track</w:t>
+      </w:r>
+      <w:r>
+        <w:rPr>
+          <w:rFonts w:asciiTheme="majorHAnsi" w:hAnsiTheme="majorHAnsi" w:cstheme="majorHAnsi"/>
+          <w:sz w:val="15"/>
+          <w:szCs w:val="15"/>
+        </w:rPr>
+        <w:t xml:space="preserve">s </w:t>
+      </w:r>
+      <w:r>
+        <w:rPr>
+          <w:rFonts w:asciiTheme="majorHAnsi" w:hAnsiTheme="majorHAnsi" w:cstheme="majorHAnsi"/>
+          <w:sz w:val="15"/>
+          <w:szCs w:val="15"/>
+        </w:rPr>
+        <w:t>every review for compan</w:t>
       </w:r>
       <w:r>
         <w:rPr>
@@ -2210,15 +2808,47 @@
           <w:sz w:val="15"/>
           <w:szCs w:val="15"/>
         </w:rPr>
-        <w:t xml:space="preserve"> from their chosen source (TripAdvisor, Facebook, Yelp and Google) and allowed the user to generate a custom, AI-generated response, for each review.</w:t>
-      </w:r>
-      <w:r>
-        <w:rPr>
-          <w:rFonts w:asciiTheme="majorHAnsi" w:hAnsiTheme="majorHAnsi" w:cstheme="majorHAnsi"/>
-          <w:sz w:val="15"/>
-          <w:szCs w:val="15"/>
-        </w:rPr>
-        <w:t xml:space="preserve"> Video explanation can be found here: </w:t>
+        <w:t xml:space="preserve"> from their chosen source</w:t>
+      </w:r>
+      <w:r>
+        <w:rPr>
+          <w:rFonts w:asciiTheme="majorHAnsi" w:hAnsiTheme="majorHAnsi" w:cstheme="majorHAnsi"/>
+          <w:sz w:val="15"/>
+          <w:szCs w:val="15"/>
+        </w:rPr>
+        <w:t>(s)</w:t>
+      </w:r>
+      <w:r>
+        <w:rPr>
+          <w:rFonts w:asciiTheme="majorHAnsi" w:hAnsiTheme="majorHAnsi" w:cstheme="majorHAnsi"/>
+          <w:sz w:val="15"/>
+          <w:szCs w:val="15"/>
+        </w:rPr>
+        <w:t xml:space="preserve"> (TripAdvisor, Facebook, Yelp and Google) and allow</w:t>
+      </w:r>
+      <w:r>
+        <w:rPr>
+          <w:rFonts w:asciiTheme="majorHAnsi" w:hAnsiTheme="majorHAnsi" w:cstheme="majorHAnsi"/>
+          <w:sz w:val="15"/>
+          <w:szCs w:val="15"/>
+        </w:rPr>
+        <w:t xml:space="preserve">s </w:t>
+      </w:r>
+      <w:r>
+        <w:rPr>
+          <w:rFonts w:asciiTheme="majorHAnsi" w:hAnsiTheme="majorHAnsi" w:cstheme="majorHAnsi"/>
+          <w:sz w:val="15"/>
+          <w:szCs w:val="15"/>
+        </w:rPr>
+        <w:t>the user to generate a custom, AI-generated response, for each review.</w:t>
+      </w:r>
+      <w:r>
+        <w:rPr>
+          <w:rFonts w:asciiTheme="majorHAnsi" w:hAnsiTheme="majorHAnsi" w:cstheme="majorHAnsi"/>
+          <w:sz w:val="15"/>
+          <w:szCs w:val="15"/>
+        </w:rPr>
+        <w:t xml:space="preserve"> Video explanation can be found </w:t>
       </w:r>
       <w:hyperlink r:id="rId11" w:anchor="/projects" w:history="1">
         <w:r>
@@ -2228,9 +2858,17 @@
             <w:sz w:val="15"/>
             <w:szCs w:val="15"/>
           </w:rPr>
-          <w:t>https://huntertcarver.com/#/projects</w:t>
+          <w:t>here</w:t>
         </w:r>
       </w:hyperlink>
+      <w:r>
+        <w:rPr>
+          <w:rFonts w:asciiTheme="majorHAnsi" w:hAnsiTheme="majorHAnsi" w:cstheme="majorHAnsi"/>
+          <w:sz w:val="15"/>
+          <w:szCs w:val="15"/>
+        </w:rPr>
+        <w:t>.</w:t>
+      </w:r>
     </w:p>
     <w:p>
       <w:pPr>
@@ -2320,7 +2958,7 @@
               </wp:anchor>
             </w:drawing>
           </mc:Choice>
-          <mc:Fallback xmlns:w16du="http://schemas.microsoft.com/office/word/2023/wordml/word16du">
+          <mc:Fallback>
             <w:pict>
               <v:line w14:anchorId="5BD5DA82" id="Straight Connector 2" o:spid="_x0000_s1026" style="position:absolute;flip:y;z-index:251673600;visibility:visible;mso-wrap-style:square;mso-width-percent:0;mso-height-percent:0;mso-wrap-distance-left:9pt;mso-wrap-distance-top:0;mso-wrap-distance-right:9pt;mso-wrap-distance-bottom:0;mso-position-horizontal:right;mso-position-horizontal-relative:margin;mso-position-vertical:absolute;mso-position-vertical-relative:text;mso-width-percent:0;mso-height-percent:0;mso-width-relative:margin;mso-height-relative:margin" from="363.5pt,5.7pt" to="778.2pt,5.7pt" o:gfxdata="UEsDBBQABgAIAAAAIQC2gziS/gAAAOEBAAATAAAAW0NvbnRlbnRfVHlwZXNdLnhtbJSRQU7DMBBF&#10;90jcwfIWJU67QAgl6YK0S0CoHGBkTxKLZGx5TGhvj5O2G0SRWNoz/78nu9wcxkFMGNg6quQqL6RA&#10;0s5Y6ir5vt9lD1JwBDIwOMJKHpHlpr69KfdHjyxSmriSfYz+USnWPY7AufNIadK6MEJMx9ApD/oD&#10;OlTrorhX2lFEilmcO2RdNtjC5xDF9pCuTyYBB5bi6bQ4syoJ3g9WQ0ymaiLzg5KdCXlKLjvcW893&#10;SUOqXwnz5DrgnHtJTxOsQfEKIT7DmDSUCaxw7Rqn8787ZsmRM9e2VmPeBN4uqYvTtW7jvijg9N/y&#10;JsXecLq0q+WD6m8AAAD//wMAUEsDBBQABgAIAAAAIQA4/SH/1gAAAJQBAAALAAAAX3JlbHMvLnJl&#10;bHOkkMFqwzAMhu+DvYPRfXGawxijTi+j0GvpHsDYimMaW0Yy2fr2M4PBMnrbUb/Q94l/f/hMi1qR&#10;JVI2sOt6UJgd+ZiDgffL8ekFlFSbvV0oo4EbChzGx4f9GRdb25HMsYhqlCwG5lrLq9biZkxWOiqY&#10;22YiTra2kYMu1l1tQD30/bPm3wwYN0x18gb45AdQl1tp5j/sFB2T0FQ7R0nTNEV3j6o9feQzro1i&#10;OWA14Fm+Q8a1a8+Bvu/d/dMb2JY5uiPbhG/ktn4cqGU/er3pcvwCAAD//wMAUEsDBBQABgAIAAAA&#10;IQCXYztyuwEAAN4DAAAOAAAAZHJzL2Uyb0RvYy54bWysU02P0zAQvSPxHyzfqdNqqSBquoddLRcE&#10;K77uXmfcWLI9lm2a9N8zdtp0BQgJxMXK2PPezHsz2d1OzrIjxGTQd3y9ajgDr7A3/tDxr18eXr3h&#10;LGXpe2nRQ8dPkPjt/uWL3Rha2OCAtofIiMSndgwdH3IOrRBJDeBkWmEAT48ao5OZwngQfZQjsTsr&#10;Nk2zFSPGPkRUkBLd3s+PfF/5tQaVP2qdIDPbceot1zPW86mcYr+T7SHKMBh1bkP+QxdOGk9FF6p7&#10;mSX7Hs0vVM6oiAl1Xil0ArU2CqoGUrNuflLzeZABqhYyJ4XFpvT/aNWH451/jGTDGFKbwmMsKiYd&#10;HdPWhG8006qLOmVTte202AZTZoouX2+227c3N5ypy5uYKQpViCm/A3SsfHTcGl8UyVYe36dMZSn1&#10;klKurS9nQmv6B2NtDcouwJ2N7Chpinlal6kR7lkWRQUpriLqVz5ZmFk/gWamp2ZnOXW/rpxSKfD5&#10;wms9ZReYpg4WYFPb/iPwnF+gUHfvb8ALolZGnxewMx7j76pfrdBz/sWBWXex4An7Ux1vtYaWqDp3&#10;Xviypc/jCr/+lvsfAAAA//8DAFBLAwQUAAYACAAAACEAsHEN6dsAAAAGAQAADwAAAGRycy9kb3du&#10;cmV2LnhtbEyPQU/DMAyF70j8h8hI3FjaCaFRmk4IiQPSNMbGAW5ZYtpC45TG3cq/x4gD3Oz3rOfv&#10;lcspdOqAQ2ojGchnGSgkF31LtYHn3f3FAlRiS952kdDAFyZYVqcnpS18PNITHrZcKwmhVFgDDXNf&#10;aJ1cg8GmWeyRxHuLQ7As61BrP9ijhIdOz7PsSgfbknxobI93DbqP7RgMvOQPnxvXv292j271Oqx4&#10;vUYejTk/m25vQDFO/HcMP/iCDpUw7eNIPqnOgBRhUfNLUOIu5tcy7H8FXZX6P371DQAA//8DAFBL&#10;AQItABQABgAIAAAAIQC2gziS/gAAAOEBAAATAAAAAAAAAAAAAAAAAAAAAABbQ29udGVudF9UeXBl&#10;c10ueG1sUEsBAi0AFAAGAAgAAAAhADj9If/WAAAAlAEAAAsAAAAAAAAAAAAAAAAALwEAAF9yZWxz&#10;Ly5yZWxzUEsBAi0AFAAGAAgAAAAhAJdjO3K7AQAA3gMAAA4AAAAAAAAAAAAAAAAALgIAAGRycy9l&#10;Mm9Eb2MueG1sUEsBAi0AFAAGAAgAAAAhALBxDenbAAAABgEAAA8AAAAAAAAAAAAAAAAAFQQAAGRy&#10;cy9kb3ducmV2LnhtbFBLBQYAAAAABAAEAPMAAAAdBQAAAAA=&#10;" strokecolor="black [3213]" strokeweight=".5pt">
                 <v:stroke joinstyle="miter"/>
@@ -3129,7 +3767,7 @@
 </file>
 
 <file path=word/endnotes.xml><?xml version="1.0" encoding="utf-8"?>
-<w:endnotes xmlns:wpc="http://schemas.microsoft.com/office/word/2010/wordprocessingCanvas" xmlns:cx="http://schemas.microsoft.com/office/drawing/2014/chartex" xmlns:cx1="http://schemas.microsoft.com/office/drawing/2015/9/8/chartex" xmlns:cx2="http://schemas.microsoft.com/office/drawing/2015/10/21/chartex" xmlns:cx3="http://schemas.microsoft.com/office/drawing/2016/5/9/chartex" xmlns:cx4="http://schemas.microsoft.com/office/drawing/2016/5/10/chartex" xmlns:cx5="http://schemas.microsoft.com/office/drawing/2016/5/11/chartex" xmlns:cx6="http://schemas.microsoft.com/office/drawing/2016/5/12/chartex" xmlns:cx7="http://schemas.microsoft.com/office/drawing/2016/5/13/chartex" xmlns:cx8="http://schemas.microsoft.com/office/drawing/2016/5/14/chartex" xmlns:mc="http://schemas.openxmlformats.org/markup-compatibility/2006" xmlns:aink="http://schemas.microsoft.com/office/drawing/2016/ink" xmlns:am3d="http://schemas.microsoft.com/office/drawing/2017/model3d" xmlns:o="urn:schemas-microsoft-com:office:office" xmlns:oel="http://schemas.microsoft.com/office/2019/extlst" xmlns:r="http://schemas.openxmlformats.org/officeDocument/2006/relationships" xmlns:m="http://schemas.openxmlformats.org/officeDocument/2006/math" xmlns:v="urn:schemas-microsoft-com:vml" xmlns:wp14="http://schemas.microsoft.com/office/word/2010/wordprocessingDrawing" xmlns:wp="http://schemas.openxmlformats.org/drawingml/2006/wordprocessingDrawing" xmlns:w10="urn:schemas-microsoft-com:office:word" xmlns:w="http://schemas.openxmlformats.org/wordprocessingml/2006/main" xmlns:w14="http://schemas.microsoft.com/office/word/2010/wordml" xmlns:w15="http://schemas.microsoft.com/office/word/2012/wordml" xmlns:w16cex="http://schemas.microsoft.com/office/word/2018/wordml/cex" xmlns:w16cid="http://schemas.microsoft.com/office/word/2016/wordml/cid" xmlns:w16="http://schemas.microsoft.com/office/word/2018/wordml" xmlns:w16sdtdh="http://schemas.microsoft.com/office/word/2020/wordml/sdtdatahash" xmlns:w16se="http://schemas.microsoft.com/office/word/2015/wordml/symex" xmlns:wpg="http://schemas.microsoft.com/office/word/2010/wordprocessingGroup" xmlns:wpi="http://schemas.microsoft.com/office/word/2010/wordprocessingInk" xmlns:wne="http://schemas.microsoft.com/office/word/2006/wordml" xmlns:wps="http://schemas.microsoft.com/office/word/2010/wordprocessingShape" mc:Ignorable="w14 w15 w16se w16cid w16 w16cex w16sdtdh wp14">
+<w:endnotes xmlns:wpc="http://schemas.microsoft.com/office/word/2010/wordprocessingCanvas" xmlns:cx="http://schemas.microsoft.com/office/drawing/2014/chartex" xmlns:cx1="http://schemas.microsoft.com/office/drawing/2015/9/8/chartex" xmlns:cx2="http://schemas.microsoft.com/office/drawing/2015/10/21/chartex" xmlns:cx3="http://schemas.microsoft.com/office/drawing/2016/5/9/chartex" xmlns:cx4="http://schemas.microsoft.com/office/drawing/2016/5/10/chartex" xmlns:cx5="http://schemas.microsoft.com/office/drawing/2016/5/11/chartex" xmlns:cx6="http://schemas.microsoft.com/office/drawing/2016/5/12/chartex" xmlns:cx7="http://schemas.microsoft.com/office/drawing/2016/5/13/chartex" xmlns:cx8="http://schemas.microsoft.com/office/drawing/2016/5/14/chartex" xmlns:mc="http://schemas.openxmlformats.org/markup-compatibility/2006" xmlns:aink="http://schemas.microsoft.com/office/drawing/2016/ink" xmlns:am3d="http://schemas.microsoft.com/office/drawing/2017/model3d" xmlns:o="urn:schemas-microsoft-com:office:office" xmlns:oel="http://schemas.microsoft.com/office/2019/extlst" xmlns:r="http://schemas.openxmlformats.org/officeDocument/2006/relationships" xmlns:m="http://schemas.openxmlformats.org/officeDocument/2006/math" xmlns:v="urn:schemas-microsoft-com:vml" xmlns:wp14="http://schemas.microsoft.com/office/word/2010/wordprocessingDrawing" xmlns:wp="http://schemas.openxmlformats.org/drawingml/2006/wordprocessingDrawing" xmlns:w10="urn:schemas-microsoft-com:office:word" xmlns:w="http://schemas.openxmlformats.org/wordprocessingml/2006/main" xmlns:w14="http://schemas.microsoft.com/office/word/2010/wordml" xmlns:w15="http://schemas.microsoft.com/office/word/2012/wordml" xmlns:w16cex="http://schemas.microsoft.com/office/word/2018/wordml/cex" xmlns:w16cid="http://schemas.microsoft.com/office/word/2016/wordml/cid" xmlns:w16="http://schemas.microsoft.com/office/word/2018/wordml" xmlns:w16du="http://schemas.microsoft.com/office/word/2023/wordml/word16du" xmlns:w16sdtdh="http://schemas.microsoft.com/office/word/2020/wordml/sdtdatahash" xmlns:w16se="http://schemas.microsoft.com/office/word/2015/wordml/symex" xmlns:wpg="http://schemas.microsoft.com/office/word/2010/wordprocessingGroup" xmlns:wpi="http://schemas.microsoft.com/office/word/2010/wordprocessingInk" xmlns:wne="http://schemas.microsoft.com/office/word/2006/wordml" xmlns:wps="http://schemas.microsoft.com/office/word/2010/wordprocessingShape" mc:Ignorable="w14 w15 w16se w16cid w16 w16cex w16sdtdh w16du wp14">
   <w:endnote w:type="separator" w:id="-1">
     <w:p>
       <w:pPr>
@@ -3161,7 +3799,7 @@
 </file>
 
 <file path=word/footnotes.xml><?xml version="1.0" encoding="utf-8"?>
-<w:footnotes xmlns:wpc="http://schemas.microsoft.com/office/word/2010/wordprocessingCanvas" xmlns:cx="http://schemas.microsoft.com/office/drawing/2014/chartex" xmlns:cx1="http://schemas.microsoft.com/office/drawing/2015/9/8/chartex" xmlns:cx2="http://schemas.microsoft.com/office/drawing/2015/10/21/chartex" xmlns:cx3="http://schemas.microsoft.com/office/drawing/2016/5/9/chartex" xmlns:cx4="http://schemas.microsoft.com/office/drawing/2016/5/10/chartex" xmlns:cx5="http://schemas.microsoft.com/office/drawing/2016/5/11/chartex" xmlns:cx6="http://schemas.microsoft.com/office/drawing/2016/5/12/chartex" xmlns:cx7="http://schemas.microsoft.com/office/drawing/2016/5/13/chartex" xmlns:cx8="http://schemas.microsoft.com/office/drawing/2016/5/14/chartex" xmlns:mc="http://schemas.openxmlformats.org/markup-compatibility/2006" xmlns:aink="http://schemas.microsoft.com/office/drawing/2016/ink" xmlns:am3d="http://schemas.microsoft.com/office/drawing/2017/model3d" xmlns:o="urn:schemas-microsoft-com:office:office" xmlns:oel="http://schemas.microsoft.com/office/2019/extlst" xmlns:r="http://schemas.openxmlformats.org/officeDocument/2006/relationships" xmlns:m="http://schemas.openxmlformats.org/officeDocument/2006/math" xmlns:v="urn:schemas-microsoft-com:vml" xmlns:wp14="http://schemas.microsoft.com/office/word/2010/wordprocessingDrawing" xmlns:wp="http://schemas.openxmlformats.org/drawingml/2006/wordprocessingDrawing" xmlns:w10="urn:schemas-microsoft-com:office:word" xmlns:w="http://schemas.openxmlformats.org/wordprocessingml/2006/main" xmlns:w14="http://schemas.microsoft.com/office/word/2010/wordml" xmlns:w15="http://schemas.microsoft.com/office/word/2012/wordml" xmlns:w16cex="http://schemas.microsoft.com/office/word/2018/wordml/cex" xmlns:w16cid="http://schemas.microsoft.com/office/word/2016/wordml/cid" xmlns:w16="http://schemas.microsoft.com/office/word/2018/wordml" xmlns:w16sdtdh="http://schemas.microsoft.com/office/word/2020/wordml/sdtdatahash" xmlns:w16se="http://schemas.microsoft.com/office/word/2015/wordml/symex" xmlns:wpg="http://schemas.microsoft.com/office/word/2010/wordprocessingGroup" xmlns:wpi="http://schemas.microsoft.com/office/word/2010/wordprocessingInk" xmlns:wne="http://schemas.microsoft.com/office/word/2006/wordml" xmlns:wps="http://schemas.microsoft.com/office/word/2010/wordprocessingShape" mc:Ignorable="w14 w15 w16se w16cid w16 w16cex w16sdtdh wp14">
+<w:footnotes xmlns:wpc="http://schemas.microsoft.com/office/word/2010/wordprocessingCanvas" xmlns:cx="http://schemas.microsoft.com/office/drawing/2014/chartex" xmlns:cx1="http://schemas.microsoft.com/office/drawing/2015/9/8/chartex" xmlns:cx2="http://schemas.microsoft.com/office/drawing/2015/10/21/chartex" xmlns:cx3="http://schemas.microsoft.com/office/drawing/2016/5/9/chartex" xmlns:cx4="http://schemas.microsoft.com/office/drawing/2016/5/10/chartex" xmlns:cx5="http://schemas.microsoft.com/office/drawing/2016/5/11/chartex" xmlns:cx6="http://schemas.microsoft.com/office/drawing/2016/5/12/chartex" xmlns:cx7="http://schemas.microsoft.com/office/drawing/2016/5/13/chartex" xmlns:cx8="http://schemas.microsoft.com/office/drawing/2016/5/14/chartex" xmlns:mc="http://schemas.openxmlformats.org/markup-compatibility/2006" xmlns:aink="http://schemas.microsoft.com/office/drawing/2016/ink" xmlns:am3d="http://schemas.microsoft.com/office/drawing/2017/model3d" xmlns:o="urn:schemas-microsoft-com:office:office" xmlns:oel="http://schemas.microsoft.com/office/2019/extlst" xmlns:r="http://schemas.openxmlformats.org/officeDocument/2006/relationships" xmlns:m="http://schemas.openxmlformats.org/officeDocument/2006/math" xmlns:v="urn:schemas-microsoft-com:vml" xmlns:wp14="http://schemas.microsoft.com/office/word/2010/wordprocessingDrawing" xmlns:wp="http://schemas.openxmlformats.org/drawingml/2006/wordprocessingDrawing" xmlns:w10="urn:schemas-microsoft-com:office:word" xmlns:w="http://schemas.openxmlformats.org/wordprocessingml/2006/main" xmlns:w14="http://schemas.microsoft.com/office/word/2010/wordml" xmlns:w15="http://schemas.microsoft.com/office/word/2012/wordml" xmlns:w16cex="http://schemas.microsoft.com/office/word/2018/wordml/cex" xmlns:w16cid="http://schemas.microsoft.com/office/word/2016/wordml/cid" xmlns:w16="http://schemas.microsoft.com/office/word/2018/wordml" xmlns:w16du="http://schemas.microsoft.com/office/word/2023/wordml/word16du" xmlns:w16sdtdh="http://schemas.microsoft.com/office/word/2020/wordml/sdtdatahash" xmlns:w16se="http://schemas.microsoft.com/office/word/2015/wordml/symex" xmlns:wpg="http://schemas.microsoft.com/office/word/2010/wordprocessingGroup" xmlns:wpi="http://schemas.microsoft.com/office/word/2010/wordprocessingInk" xmlns:wne="http://schemas.microsoft.com/office/word/2006/wordml" xmlns:wps="http://schemas.microsoft.com/office/word/2010/wordprocessingShape" mc:Ignorable="w14 w15 w16se w16cid w16 w16cex w16sdtdh w16du wp14">
   <w:footnote w:type="separator" w:id="-1">
     <w:p>
       <w:pPr>
@@ -3193,7 +3831,7 @@
 </file>
 
 <file path=word/numbering.xml><?xml version="1.0" encoding="utf-8"?>
-<w:numbering xmlns:wpc="http://schemas.microsoft.com/office/word/2010/wordprocessingCanvas" xmlns:cx="http://schemas.microsoft.com/office/drawing/2014/chartex" xmlns:cx1="http://schemas.microsoft.com/office/drawing/2015/9/8/chartex" xmlns:cx2="http://schemas.microsoft.com/office/drawing/2015/10/21/chartex" xmlns:cx3="http://schemas.microsoft.com/office/drawing/2016/5/9/chartex" xmlns:cx4="http://schemas.microsoft.com/office/drawing/2016/5/10/chartex" xmlns:cx5="http://schemas.microsoft.com/office/drawing/2016/5/11/chartex" xmlns:cx6="http://schemas.microsoft.com/office/drawing/2016/5/12/chartex" xmlns:cx7="http://schemas.microsoft.com/office/drawing/2016/5/13/chartex" xmlns:cx8="http://schemas.microsoft.com/office/drawing/2016/5/14/chartex" xmlns:mc="http://schemas.openxmlformats.org/markup-compatibility/2006" xmlns:aink="http://schemas.microsoft.com/office/drawing/2016/ink" xmlns:am3d="http://schemas.microsoft.com/office/drawing/2017/model3d" xmlns:o="urn:schemas-microsoft-com:office:office" xmlns:oel="http://schemas.microsoft.com/office/2019/extlst" xmlns:r="http://schemas.openxmlformats.org/officeDocument/2006/relationships" xmlns:m="http://schemas.openxmlformats.org/officeDocument/2006/math" xmlns:v="urn:schemas-microsoft-com:vml" xmlns:wp14="http://schemas.microsoft.com/office/word/2010/wordprocessingDrawing" xmlns:wp="http://schemas.openxmlformats.org/drawingml/2006/wordprocessingDrawing" xmlns:w10="urn:schemas-microsoft-com:office:word" xmlns:w="http://schemas.openxmlformats.org/wordprocessingml/2006/main" xmlns:w14="http://schemas.microsoft.com/office/word/2010/wordml" xmlns:w15="http://schemas.microsoft.com/office/word/2012/wordml" xmlns:w16cex="http://schemas.microsoft.com/office/word/2018/wordml/cex" xmlns:w16cid="http://schemas.microsoft.com/office/word/2016/wordml/cid" xmlns:w16="http://schemas.microsoft.com/office/word/2018/wordml" xmlns:w16sdtdh="http://schemas.microsoft.com/office/word/2020/wordml/sdtdatahash" xmlns:w16se="http://schemas.microsoft.com/office/word/2015/wordml/symex" xmlns:wpg="http://schemas.microsoft.com/office/word/2010/wordprocessingGroup" xmlns:wpi="http://schemas.microsoft.com/office/word/2010/wordprocessingInk" xmlns:wne="http://schemas.microsoft.com/office/word/2006/wordml" xmlns:wps="http://schemas.microsoft.com/office/word/2010/wordprocessingShape" mc:Ignorable="w14 w15 w16se w16cid w16 w16cex w16sdtdh wp14">
+<w:numbering xmlns:wpc="http://schemas.microsoft.com/office/word/2010/wordprocessingCanvas" xmlns:cx="http://schemas.microsoft.com/office/drawing/2014/chartex" xmlns:cx1="http://schemas.microsoft.com/office/drawing/2015/9/8/chartex" xmlns:cx2="http://schemas.microsoft.com/office/drawing/2015/10/21/chartex" xmlns:cx3="http://schemas.microsoft.com/office/drawing/2016/5/9/chartex" xmlns:cx4="http://schemas.microsoft.com/office/drawing/2016/5/10/chartex" xmlns:cx5="http://schemas.microsoft.com/office/drawing/2016/5/11/chartex" xmlns:cx6="http://schemas.microsoft.com/office/drawing/2016/5/12/chartex" xmlns:cx7="http://schemas.microsoft.com/office/drawing/2016/5/13/chartex" xmlns:cx8="http://schemas.microsoft.com/office/drawing/2016/5/14/chartex" xmlns:mc="http://schemas.openxmlformats.org/markup-compatibility/2006" xmlns:aink="http://schemas.microsoft.com/office/drawing/2016/ink" xmlns:am3d="http://schemas.microsoft.com/office/drawing/2017/model3d" xmlns:o="urn:schemas-microsoft-com:office:office" xmlns:oel="http://schemas.microsoft.com/office/2019/extlst" xmlns:r="http://schemas.openxmlformats.org/officeDocument/2006/relationships" xmlns:m="http://schemas.openxmlformats.org/officeDocument/2006/math" xmlns:v="urn:schemas-microsoft-com:vml" xmlns:wp14="http://schemas.microsoft.com/office/word/2010/wordprocessingDrawing" xmlns:wp="http://schemas.openxmlformats.org/drawingml/2006/wordprocessingDrawing" xmlns:w10="urn:schemas-microsoft-com:office:word" xmlns:w="http://schemas.openxmlformats.org/wordprocessingml/2006/main" xmlns:w14="http://schemas.microsoft.com/office/word/2010/wordml" xmlns:w15="http://schemas.microsoft.com/office/word/2012/wordml" xmlns:w16cex="http://schemas.microsoft.com/office/word/2018/wordml/cex" xmlns:w16cid="http://schemas.microsoft.com/office/word/2016/wordml/cid" xmlns:w16="http://schemas.microsoft.com/office/word/2018/wordml" xmlns:w16du="http://schemas.microsoft.com/office/word/2023/wordml/word16du" xmlns:w16sdtdh="http://schemas.microsoft.com/office/word/2020/wordml/sdtdatahash" xmlns:w16se="http://schemas.microsoft.com/office/word/2015/wordml/symex" xmlns:wpg="http://schemas.microsoft.com/office/word/2010/wordprocessingGroup" xmlns:wpi="http://schemas.microsoft.com/office/word/2010/wordprocessingInk" xmlns:wne="http://schemas.microsoft.com/office/word/2006/wordml" xmlns:wps="http://schemas.microsoft.com/office/word/2010/wordprocessingShape" mc:Ignorable="w14 w15 w16se w16cid w16 w16cex w16sdtdh w16du wp14">
   <w:abstractNum w:abstractNumId="0" w15:restartNumberingAfterBreak="0">
     <w:nsid w:val="0C1242DC"/>
     <w:multiLevelType w:val="hybridMultilevel"/>
@@ -4325,7 +4963,7 @@
   <w:abstractNum w:abstractNumId="10" w15:restartNumberingAfterBreak="0">
     <w:nsid w:val="450768F7"/>
     <w:multiLevelType w:val="hybridMultilevel"/>
-    <w:tmpl w:val="49FEF966"/>
+    <w:tmpl w:val="E038834C"/>
     <w:lvl w:ilvl="0" w:tplc="39DAC51E">
       <w:start w:val="1"/>
       <w:numFmt w:val="bullet"/>
@@ -4338,18 +4976,17 @@
         <w:rFonts w:ascii="Symbol" w:hAnsi="Symbol" w:hint="default"/>
       </w:rPr>
     </w:lvl>
-    <w:lvl w:ilvl="1" w:tplc="7638CCB8">
-      <w:start w:val="1"/>
-      <w:numFmt w:val="bullet"/>
-      <w:lvlText w:val=""/>
+    <w:lvl w:ilvl="1" w:tplc="77847400">
+      <w:start w:val="1"/>
+      <w:numFmt w:val="bullet"/>
+      <w:lvlText w:val=""/>
       <w:lvlJc w:val="left"/>
       <w:pPr>
         <w:ind w:left="1080" w:hanging="360"/>
       </w:pPr>
       <w:rPr>
         <w:rFonts w:ascii="Symbol" w:hAnsi="Symbol" w:hint="default"/>
-        <w:b w:val="0"/>
-        <w:bCs/>
+        <w:color w:val="auto"/>
       </w:rPr>
     </w:lvl>
     <w:lvl w:ilvl="2" w:tplc="04090005">
@@ -4821,7 +5458,7 @@
 </file>
 
 <file path=word/styles.xml><?xml version="1.0" encoding="utf-8"?>
-<w:styles xmlns:mc="http://schemas.openxmlformats.org/markup-compatibility/2006" xmlns:r="http://schemas.openxmlformats.org/officeDocument/2006/relationships" xmlns:w="http://schemas.openxmlformats.org/wordprocessingml/2006/main" xmlns:w14="http://schemas.microsoft.com/office/word/2010/wordml" xmlns:w15="http://schemas.microsoft.com/office/word/2012/wordml" xmlns:w16cex="http://schemas.microsoft.com/office/word/2018/wordml/cex" xmlns:w16cid="http://schemas.microsoft.com/office/word/2016/wordml/cid" xmlns:w16="http://schemas.microsoft.com/office/word/2018/wordml" xmlns:w16sdtdh="http://schemas.microsoft.com/office/word/2020/wordml/sdtdatahash" xmlns:w16se="http://schemas.microsoft.com/office/word/2015/wordml/symex" mc:Ignorable="w14 w15 w16se w16cid w16 w16cex w16sdtdh">
+<w:styles xmlns:mc="http://schemas.openxmlformats.org/markup-compatibility/2006" xmlns:r="http://schemas.openxmlformats.org/officeDocument/2006/relationships" xmlns:w="http://schemas.openxmlformats.org/wordprocessingml/2006/main" xmlns:w14="http://schemas.microsoft.com/office/word/2010/wordml" xmlns:w15="http://schemas.microsoft.com/office/word/2012/wordml" xmlns:w16cex="http://schemas.microsoft.com/office/word/2018/wordml/cex" xmlns:w16cid="http://schemas.microsoft.com/office/word/2016/wordml/cid" xmlns:w16="http://schemas.microsoft.com/office/word/2018/wordml" xmlns:w16du="http://schemas.microsoft.com/office/word/2023/wordml/word16du" xmlns:w16sdtdh="http://schemas.microsoft.com/office/word/2020/wordml/sdtdatahash" xmlns:w16se="http://schemas.microsoft.com/office/word/2015/wordml/symex" mc:Ignorable="w14 w15 w16se w16cid w16 w16cex w16sdtdh w16du">
   <w:docDefaults>
     <w:rPrDefault>
       <w:rPr>

</xml_diff>